<commit_message>
Update file CV ke versi terbaru
</commit_message>
<xml_diff>
--- a/public/Mohammad_Fauzan_CV-ATS.docx
+++ b/public/Mohammad_Fauzan_CV-ATS.docx
@@ -1,6 +1,6 @@
 
 <file path=word/document.xml><?xml version="1.0" encoding="utf-8"?>
-<w:document xmlns:wpc="http://schemas.microsoft.com/office/word/2010/wordprocessingCanvas" xmlns:cx="http://schemas.microsoft.com/office/drawing/2014/chartex" xmlns:cx1="http://schemas.microsoft.com/office/drawing/2015/9/8/chartex" xmlns:cx2="http://schemas.microsoft.com/office/drawing/2015/10/21/chartex" xmlns:cx3="http://schemas.microsoft.com/office/drawing/2016/5/9/chartex" xmlns:cx4="http://schemas.microsoft.com/office/drawing/2016/5/10/chartex" xmlns:cx5="http://schemas.microsoft.com/office/drawing/2016/5/11/chartex" xmlns:cx6="http://schemas.microsoft.com/office/drawing/2016/5/12/chartex" xmlns:cx7="http://schemas.microsoft.com/office/drawing/2016/5/13/chartex" xmlns:cx8="http://schemas.microsoft.com/office/drawing/2016/5/14/chartex" xmlns:mc="http://schemas.openxmlformats.org/markup-compatibility/2006" xmlns:aink="http://schemas.microsoft.com/office/drawing/2016/ink" xmlns:am3d="http://schemas.microsoft.com/office/drawing/2017/model3d" xmlns:o="urn:schemas-microsoft-com:office:office" xmlns:oel="http://schemas.microsoft.com/office/2019/extlst" xmlns:r="http://schemas.openxmlformats.org/officeDocument/2006/relationships" xmlns:m="http://schemas.openxmlformats.org/officeDocument/2006/math" xmlns:v="urn:schemas-microsoft-com:vml" xmlns:wp14="http://schemas.microsoft.com/office/word/2010/wordprocessingDrawing" xmlns:wp="http://schemas.openxmlformats.org/drawingml/2006/wordprocessingDrawing" xmlns:w10="urn:schemas-microsoft-com:office:word" xmlns:w="http://schemas.openxmlformats.org/wordprocessingml/2006/main" xmlns:w14="http://schemas.microsoft.com/office/word/2010/wordml" xmlns:w15="http://schemas.microsoft.com/office/word/2012/wordml" xmlns:w16cex="http://schemas.microsoft.com/office/word/2018/wordml/cex" xmlns:w16cid="http://schemas.microsoft.com/office/word/2016/wordml/cid" xmlns:w16="http://schemas.microsoft.com/office/word/2018/wordml" xmlns:w16du="http://schemas.microsoft.com/office/word/2023/wordml/word16du" xmlns:w16sdtdh="http://schemas.microsoft.com/office/word/2020/wordml/sdtdatahash" xmlns:w16sdtfl="http://schemas.microsoft.com/office/word/2024/wordml/sdtformatlock" xmlns:w16se="http://schemas.microsoft.com/office/word/2015/wordml/symex" xmlns:wpg="http://schemas.microsoft.com/office/word/2010/wordprocessingGroup" xmlns:wpi="http://schemas.microsoft.com/office/word/2010/wordprocessingInk" xmlns:wne="http://schemas.microsoft.com/office/word/2006/wordml" xmlns:wps="http://schemas.microsoft.com/office/word/2010/wordprocessingShape" mc:Ignorable="w14 w15 w16se w16cid w16 w16cex w16sdtdh w16sdtfl w16du wp14">
+<w:document xmlns:wpc="http://schemas.microsoft.com/office/word/2010/wordprocessingCanvas" xmlns:cx="http://schemas.microsoft.com/office/drawing/2014/chartex" xmlns:cx1="http://schemas.microsoft.com/office/drawing/2015/9/8/chartex" xmlns:cx2="http://schemas.microsoft.com/office/drawing/2015/10/21/chartex" xmlns:cx3="http://schemas.microsoft.com/office/drawing/2016/5/9/chartex" xmlns:cx4="http://schemas.microsoft.com/office/drawing/2016/5/10/chartex" xmlns:cx5="http://schemas.microsoft.com/office/drawing/2016/5/11/chartex" xmlns:cx6="http://schemas.microsoft.com/office/drawing/2016/5/12/chartex" xmlns:cx7="http://schemas.microsoft.com/office/drawing/2016/5/13/chartex" xmlns:cx8="http://schemas.microsoft.com/office/drawing/2016/5/14/chartex" xmlns:mc="http://schemas.openxmlformats.org/markup-compatibility/2006" xmlns:aink="http://schemas.microsoft.com/office/drawing/2016/ink" xmlns:am3d="http://schemas.microsoft.com/office/drawing/2017/model3d" xmlns:o="urn:schemas-microsoft-com:office:office" xmlns:oel="http://schemas.microsoft.com/office/2019/extlst" xmlns:r="http://schemas.openxmlformats.org/officeDocument/2006/relationships" xmlns:m="http://schemas.openxmlformats.org/officeDocument/2006/math" xmlns:v="urn:schemas-microsoft-com:vml" xmlns:wp14="http://schemas.microsoft.com/office/word/2010/wordprocessingDrawing" xmlns:wp="http://schemas.openxmlformats.org/drawingml/2006/wordprocessingDrawing" xmlns:w10="urn:schemas-microsoft-com:office:word" xmlns:w="http://schemas.openxmlformats.org/wordprocessingml/2006/main" xmlns:w14="http://schemas.microsoft.com/office/word/2010/wordml" xmlns:w15="http://schemas.microsoft.com/office/word/2012/wordml" xmlns:w16cei="http://schemas.microsoft.com/office/word/2026/wordml/cei" xmlns:w16cex="http://schemas.microsoft.com/office/word/2018/wordml/cex" xmlns:w16cid="http://schemas.microsoft.com/office/word/2016/wordml/cid" xmlns:w16="http://schemas.microsoft.com/office/word/2018/wordml" xmlns:w16du="http://schemas.microsoft.com/office/word/2023/wordml/word16du" xmlns:w16sdtdh="http://schemas.microsoft.com/office/word/2020/wordml/sdtdatahash" xmlns:w16sdtfl="http://schemas.microsoft.com/office/word/2024/wordml/sdtformatlock" xmlns:w16se="http://schemas.microsoft.com/office/word/2015/wordml/symex" xmlns:wpg="http://schemas.microsoft.com/office/word/2010/wordprocessingGroup" xmlns:wpi="http://schemas.microsoft.com/office/word/2010/wordprocessingInk" xmlns:wne="http://schemas.microsoft.com/office/word/2006/wordml" xmlns:wps="http://schemas.microsoft.com/office/word/2010/wordprocessingShape" mc:Ignorable="w14 w15 w16se w16cid w16 w16cex w16sdtdh w16sdtfl w16du wp14">
   <w:body>
     <w:p>
       <w:pPr>
@@ -44,10 +44,10 @@
         <w:jc w:val="center"/>
         <w:rPr>
           <w:rFonts w:ascii="Times New Roman" w:eastAsia="Times New Roman" w:hAnsi="Times New Roman" w:cs="Times New Roman"/>
-          <w:b/>
-          <w:bCs/>
-          <w:sz w:val="22"/>
-          <w:szCs w:val="22"/>
+          <w:color w:val="0563C1"/>
+          <w:sz w:val="22"/>
+          <w:szCs w:val="22"/>
+          <w:u w:val="single"/>
           <w:lang w:val="sv-SE"/>
         </w:rPr>
       </w:pPr>
@@ -94,7 +94,7 @@
       </w:r>
       <w:r>
         <w:rPr>
-          <w:rFonts w:ascii="Arial" w:eastAsia="Arial" w:hAnsi="Arial" w:cs="Arial"/>
+          <w:rFonts w:ascii="Times New Roman" w:eastAsia="Arial" w:hAnsi="Times New Roman" w:cs="Times New Roman"/>
           <w:color w:val="1155CC"/>
           <w:sz w:val="20"/>
           <w:szCs w:val="20"/>
@@ -106,6 +106,57 @@
       <w:r>
         <w:fldChar w:fldCharType="end"/>
       </w:r>
+      <w:r>
+        <w:rPr>
+          <w:rFonts w:ascii="Times New Roman" w:hAnsi="Times New Roman" w:cs="Times New Roman"/>
+          <w:lang w:val="sv-SE"/>
+        </w:rPr>
+        <w:t xml:space="preserve"> </w:t>
+      </w:r>
+      <w:r>
+        <w:rPr>
+          <w:rFonts w:ascii="Times New Roman" w:eastAsia="Times New Roman" w:hAnsi="Times New Roman" w:cs="Times New Roman"/>
+          <w:sz w:val="21"/>
+          <w:szCs w:val="21"/>
+          <w:lang w:val="sv-SE"/>
+        </w:rPr>
+        <w:t>|</w:t>
+      </w:r>
+      <w:r>
+        <w:rPr>
+          <w:rFonts w:ascii="Times New Roman" w:eastAsia="Times New Roman" w:hAnsi="Times New Roman" w:cs="Times New Roman"/>
+          <w:sz w:val="20"/>
+          <w:szCs w:val="20"/>
+          <w:lang w:val="sv-SE"/>
+        </w:rPr>
+        <w:t xml:space="preserve"> </w:t>
+      </w:r>
+      <w:hyperlink r:id="rId5" w:tgtFrame="_parent" w:history="1">
+        <w:r>
+          <w:rPr>
+            <w:rFonts w:ascii="Times New Roman" w:eastAsia="Times New Roman" w:hAnsi="Times New Roman" w:cs="Times New Roman"/>
+            <w:color w:val="0563C1"/>
+            <w:sz w:val="20"/>
+            <w:szCs w:val="20"/>
+            <w:u w:val="single"/>
+            <w:lang w:val="sv-SE"/>
+          </w:rPr>
+          <w:t>Website Portofolio</w:t>
+        </w:r>
+      </w:hyperlink>
+    </w:p>
+    <w:p>
+      <w:pPr>
+        <w:jc w:val="center"/>
+        <w:rPr>
+          <w:rFonts w:ascii="Times New Roman" w:eastAsia="Times New Roman" w:hAnsi="Times New Roman" w:cs="Times New Roman"/>
+          <w:b/>
+          <w:bCs/>
+          <w:sz w:val="22"/>
+          <w:szCs w:val="22"/>
+          <w:lang w:val="sv-SE"/>
+        </w:rPr>
+      </w:pPr>
     </w:p>
     <w:p>
       <w:pPr>
@@ -328,7 +379,20 @@
           <w:szCs w:val="21"/>
           <w:lang w:val="sv-SE"/>
         </w:rPr>
-        <w:t>Augustus 2022 – November 2022</w:t>
+        <w:t>Agustus</w:t>
+      </w:r>
+      <w:r>
+        <w:rPr>
+          <w:rFonts w:ascii="Times New Roman" w:eastAsia="Times New Roman" w:hAnsi="Times New Roman" w:cs="Times New Roman"/>
+          <w:b/>
+          <w:bCs/>
+          <w:i/>
+          <w:iCs/>
+          <w:sz w:val="21"/>
+          <w:szCs w:val="21"/>
+          <w:lang w:val="sv-SE"/>
+        </w:rPr>
+        <w:t xml:space="preserve"> 2022 – November 2022</w:t>
       </w:r>
     </w:p>
     <w:p>
@@ -354,15 +418,51 @@
           <w:szCs w:val="21"/>
           <w:lang w:val="sv-SE"/>
         </w:rPr>
-        <w:t>Terlibat dalam instalasi dan konfigurasi jaringan lokal menggunakan router TP-Link.</w:t>
+        <w:t xml:space="preserve">Melakukan instalasi fisik infrastruktur jaringan lokal, termasuk perakitan kabel dan konfigurasi </w:t>
+      </w:r>
+      <w:r>
+        <w:rPr>
+          <w:rFonts w:ascii="Times New Roman" w:eastAsia="Times New Roman" w:hAnsi="Times New Roman" w:cs="Times New Roman"/>
+          <w:i/>
+          <w:iCs/>
+          <w:sz w:val="21"/>
+          <w:szCs w:val="21"/>
+          <w:lang w:val="sv-SE"/>
+        </w:rPr>
+        <w:t>hardware</w:t>
+      </w:r>
+      <w:r>
+        <w:rPr>
+          <w:rFonts w:ascii="Times New Roman" w:eastAsia="Times New Roman" w:hAnsi="Times New Roman" w:cs="Times New Roman"/>
+          <w:sz w:val="21"/>
+          <w:szCs w:val="21"/>
+          <w:lang w:val="sv-SE"/>
+        </w:rPr>
+        <w:t xml:space="preserve"> </w:t>
+      </w:r>
+      <w:r>
+        <w:rPr>
+          <w:rFonts w:ascii="Times New Roman" w:eastAsia="Times New Roman" w:hAnsi="Times New Roman" w:cs="Times New Roman"/>
+          <w:i/>
+          <w:iCs/>
+          <w:sz w:val="21"/>
+          <w:szCs w:val="21"/>
+          <w:lang w:val="sv-SE"/>
+        </w:rPr>
+        <w:t>router</w:t>
+      </w:r>
+      <w:r>
+        <w:rPr>
+          <w:rFonts w:ascii="Times New Roman" w:eastAsia="Times New Roman" w:hAnsi="Times New Roman" w:cs="Times New Roman"/>
+          <w:sz w:val="21"/>
+          <w:szCs w:val="21"/>
+          <w:lang w:val="sv-SE"/>
+        </w:rPr>
+        <w:t xml:space="preserve"> TP-Link guna memastikan stabilitas konektivitas sistem sekolah.</w:t>
       </w:r>
     </w:p>
     <w:p>
       <w:pPr>
-        <w:numPr>
-          <w:ilvl w:val="0"/>
-          <w:numId w:val="3"/>
-        </w:numPr>
         <w:tabs>
           <w:tab w:val="left" w:pos="95"/>
         </w:tabs>
@@ -370,38 +470,18 @@
           <w:rFonts w:ascii="Times New Roman" w:eastAsia="Times New Roman" w:hAnsi="Times New Roman" w:cs="Times New Roman"/>
           <w:sz w:val="21"/>
           <w:szCs w:val="21"/>
-          <w:lang w:val="sv-SE"/>
-        </w:rPr>
-      </w:pPr>
-      <w:r>
-        <w:rPr>
-          <w:rFonts w:ascii="Times New Roman" w:eastAsia="Times New Roman" w:hAnsi="Times New Roman" w:cs="Times New Roman"/>
-          <w:sz w:val="21"/>
-          <w:szCs w:val="21"/>
-          <w:lang w:val="sv-SE"/>
-        </w:rPr>
-        <w:t>Menangani proses routing dan pengujian konektivitas bersama tim</w:t>
-      </w:r>
-    </w:p>
-    <w:p>
-      <w:pPr>
-        <w:tabs>
-          <w:tab w:val="left" w:pos="900"/>
-        </w:tabs>
-        <w:rPr>
-          <w:rFonts w:ascii="Times New Roman" w:eastAsia="Times New Roman" w:hAnsi="Times New Roman" w:cs="Times New Roman"/>
-          <w:sz w:val="21"/>
-          <w:szCs w:val="21"/>
-        </w:rPr>
-      </w:pPr>
-      <w:proofErr w:type="spellStart"/>
-      <w:r>
-        <w:rPr>
-          <w:rFonts w:ascii="Times New Roman" w:eastAsia="Times New Roman" w:hAnsi="Times New Roman" w:cs="Times New Roman"/>
-          <w:b/>
-          <w:bCs/>
-          <w:sz w:val="21"/>
-          <w:szCs w:val="21"/>
+          <w:lang w:val="en-ID"/>
+        </w:rPr>
+      </w:pPr>
+      <w:proofErr w:type="spellStart"/>
+      <w:r>
+        <w:rPr>
+          <w:rFonts w:ascii="Times New Roman" w:eastAsia="Times New Roman" w:hAnsi="Times New Roman" w:cs="Times New Roman"/>
+          <w:b/>
+          <w:bCs/>
+          <w:sz w:val="21"/>
+          <w:szCs w:val="21"/>
+          <w:lang w:val="en-ID"/>
         </w:rPr>
         <w:t>Prototipe</w:t>
       </w:r>
@@ -413,6 +493,7 @@
           <w:bCs/>
           <w:sz w:val="21"/>
           <w:szCs w:val="21"/>
+          <w:lang w:val="en-ID"/>
         </w:rPr>
         <w:t xml:space="preserve"> Keyless Starter Motor </w:t>
       </w:r>
@@ -424,6 +505,7 @@
           <w:bCs/>
           <w:sz w:val="21"/>
           <w:szCs w:val="21"/>
+          <w:lang w:val="en-ID"/>
         </w:rPr>
         <w:t>berbasis</w:t>
       </w:r>
@@ -435,6 +517,7 @@
           <w:bCs/>
           <w:sz w:val="21"/>
           <w:szCs w:val="21"/>
+          <w:lang w:val="en-ID"/>
         </w:rPr>
         <w:t xml:space="preserve"> BLE (ESP32).</w:t>
       </w:r>
@@ -445,6 +528,7 @@
           <w:bCs/>
           <w:sz w:val="22"/>
           <w:szCs w:val="22"/>
+          <w:lang w:val="en-ID"/>
         </w:rPr>
         <w:t xml:space="preserve"> – </w:t>
       </w:r>
@@ -455,6 +539,7 @@
           <w:bCs/>
           <w:sz w:val="21"/>
           <w:szCs w:val="21"/>
+          <w:lang w:val="en-ID"/>
         </w:rPr>
         <w:t>Bekasi, Indonesia</w:t>
       </w:r>
@@ -518,52 +603,74 @@
         </w:tabs>
         <w:rPr>
           <w:rFonts w:ascii="Times New Roman" w:eastAsia="Times New Roman" w:hAnsi="Times New Roman" w:cs="Times New Roman"/>
-          <w:sz w:val="21"/>
-          <w:szCs w:val="21"/>
-          <w:lang w:val="sv-SE"/>
-        </w:rPr>
-      </w:pPr>
-      <w:r>
-        <w:rPr>
-          <w:rFonts w:ascii="Times New Roman" w:eastAsia="Times New Roman" w:hAnsi="Times New Roman" w:cs="Times New Roman"/>
-          <w:sz w:val="21"/>
-          <w:szCs w:val="21"/>
-          <w:lang w:val="sv-SE"/>
-        </w:rPr>
-        <w:t>Mengembangkan sistem starter motor tanpa kunci menggunakan ESP32 dan Bluetooth Low Energy.</w:t>
+          <w:sz w:val="20"/>
+          <w:szCs w:val="20"/>
+          <w:lang w:val="sv-SE"/>
+        </w:rPr>
+      </w:pPr>
+      <w:r>
+        <w:rPr>
+          <w:rFonts w:ascii="Times New Roman" w:eastAsia="Times New Roman" w:hAnsi="Times New Roman" w:cs="Times New Roman"/>
+          <w:sz w:val="21"/>
+          <w:szCs w:val="21"/>
+        </w:rPr>
+        <w:t xml:space="preserve"> </w:t>
+      </w:r>
+      <w:r>
+        <w:rPr>
+          <w:rFonts w:ascii="Times New Roman" w:eastAsia="Times New Roman" w:hAnsi="Times New Roman" w:cs="Times New Roman"/>
+          <w:sz w:val="21"/>
+          <w:szCs w:val="21"/>
+          <w:lang w:val="sv-SE"/>
+        </w:rPr>
+        <w:t xml:space="preserve">Mengembangkan sirkuit </w:t>
+      </w:r>
+      <w:r>
+        <w:rPr>
+          <w:rFonts w:ascii="Times New Roman" w:eastAsia="Times New Roman" w:hAnsi="Times New Roman" w:cs="Times New Roman"/>
+          <w:i/>
+          <w:iCs/>
+          <w:sz w:val="21"/>
+          <w:szCs w:val="21"/>
+          <w:lang w:val="sv-SE"/>
+        </w:rPr>
+        <w:t>hardware starter</w:t>
+      </w:r>
+      <w:r>
+        <w:rPr>
+          <w:rFonts w:ascii="Times New Roman" w:eastAsia="Times New Roman" w:hAnsi="Times New Roman" w:cs="Times New Roman"/>
+          <w:sz w:val="21"/>
+          <w:szCs w:val="21"/>
+          <w:lang w:val="sv-SE"/>
+        </w:rPr>
+        <w:t xml:space="preserve"> motor nir-kunci berbasis ESP32 dengan memprogram logika kontrol </w:t>
+      </w:r>
+      <w:r>
+        <w:rPr>
+          <w:rFonts w:ascii="Times New Roman" w:eastAsia="Times New Roman" w:hAnsi="Times New Roman" w:cs="Times New Roman"/>
+          <w:i/>
+          <w:iCs/>
+          <w:sz w:val="21"/>
+          <w:szCs w:val="21"/>
+          <w:lang w:val="sv-SE"/>
+        </w:rPr>
+        <w:t>Bluetooth Low Energy</w:t>
+      </w:r>
+      <w:r>
+        <w:rPr>
+          <w:rFonts w:ascii="Times New Roman" w:eastAsia="Times New Roman" w:hAnsi="Times New Roman" w:cs="Times New Roman"/>
+          <w:sz w:val="21"/>
+          <w:szCs w:val="21"/>
+          <w:lang w:val="sv-SE"/>
+        </w:rPr>
+        <w:t xml:space="preserve"> (BLE) menggunakan C/C++ guna meningkatkan perlindungan fisik kendaraan.</w:t>
       </w:r>
     </w:p>
     <w:p>
       <w:pPr>
-        <w:numPr>
-          <w:ilvl w:val="0"/>
-          <w:numId w:val="5"/>
-        </w:numPr>
         <w:tabs>
           <w:tab w:val="left" w:pos="284"/>
           <w:tab w:val="left" w:pos="630"/>
-        </w:tabs>
-        <w:rPr>
-          <w:rFonts w:ascii="Times New Roman" w:eastAsia="Times New Roman" w:hAnsi="Times New Roman" w:cs="Times New Roman"/>
-          <w:sz w:val="21"/>
-          <w:szCs w:val="21"/>
-          <w:lang w:val="sv-SE"/>
-        </w:rPr>
-      </w:pPr>
-      <w:r>
-        <w:rPr>
-          <w:rFonts w:ascii="Times New Roman" w:eastAsia="Times New Roman" w:hAnsi="Times New Roman" w:cs="Times New Roman"/>
-          <w:sz w:val="21"/>
-          <w:szCs w:val="21"/>
-          <w:lang w:val="sv-SE"/>
-        </w:rPr>
-        <w:t>Terinspirasi dari konsep keamanan motor GSX untuk meningkatkan perlindungan kendaraan.</w:t>
-      </w:r>
-    </w:p>
-    <w:p>
-      <w:pPr>
-        <w:tabs>
-          <w:tab w:val="left" w:pos="900"/>
         </w:tabs>
         <w:rPr>
           <w:rFonts w:ascii="Times New Roman" w:eastAsia="Times New Roman" w:hAnsi="Times New Roman" w:cs="Times New Roman"/>
@@ -735,7 +842,7 @@
         </w:numPr>
         <w:tabs>
           <w:tab w:val="left" w:pos="284"/>
-          <w:tab w:val="left" w:pos="630"/>
+          <w:tab w:val="left" w:pos="709"/>
         </w:tabs>
         <w:rPr>
           <w:rFonts w:ascii="Times New Roman" w:eastAsia="Times New Roman" w:hAnsi="Times New Roman" w:cs="Times New Roman"/>
@@ -750,7 +857,25 @@
           <w:sz w:val="21"/>
           <w:szCs w:val="21"/>
         </w:rPr>
-        <w:t>Membangun</w:t>
+        <w:t>Merakit</w:t>
+      </w:r>
+      <w:proofErr w:type="spellEnd"/>
+      <w:r>
+        <w:rPr>
+          <w:rFonts w:ascii="Times New Roman" w:eastAsia="Times New Roman" w:hAnsi="Times New Roman" w:cs="Times New Roman"/>
+          <w:sz w:val="21"/>
+          <w:szCs w:val="21"/>
+        </w:rPr>
+        <w:t xml:space="preserve"> dan </w:t>
+      </w:r>
+      <w:proofErr w:type="spellStart"/>
+      <w:r>
+        <w:rPr>
+          <w:rFonts w:ascii="Times New Roman" w:eastAsia="Times New Roman" w:hAnsi="Times New Roman" w:cs="Times New Roman"/>
+          <w:sz w:val="21"/>
+          <w:szCs w:val="21"/>
+        </w:rPr>
+        <w:t>menyolder</w:t>
       </w:r>
       <w:proofErr w:type="spellEnd"/>
       <w:r>
@@ -761,16 +886,16 @@
         </w:rPr>
         <w:t xml:space="preserve"> </w:t>
       </w:r>
-      <w:proofErr w:type="spellStart"/>
-      <w:r>
-        <w:rPr>
-          <w:rFonts w:ascii="Times New Roman" w:eastAsia="Times New Roman" w:hAnsi="Times New Roman" w:cs="Times New Roman"/>
-          <w:sz w:val="21"/>
-          <w:szCs w:val="21"/>
-        </w:rPr>
-        <w:t>sistem</w:t>
-      </w:r>
-      <w:proofErr w:type="spellEnd"/>
+      <w:r>
+        <w:rPr>
+          <w:rFonts w:ascii="Times New Roman" w:eastAsia="Times New Roman" w:hAnsi="Times New Roman" w:cs="Times New Roman"/>
+          <w:i/>
+          <w:iCs/>
+          <w:sz w:val="21"/>
+          <w:szCs w:val="21"/>
+        </w:rPr>
+        <w:t>hardware</w:t>
+      </w:r>
       <w:r>
         <w:rPr>
           <w:rFonts w:ascii="Times New Roman" w:eastAsia="Times New Roman" w:hAnsi="Times New Roman" w:cs="Times New Roman"/>
@@ -786,7 +911,25 @@
           <w:sz w:val="21"/>
           <w:szCs w:val="21"/>
         </w:rPr>
-        <w:t>absensi</w:t>
+        <w:t>pembaca</w:t>
+      </w:r>
+      <w:proofErr w:type="spellEnd"/>
+      <w:r>
+        <w:rPr>
+          <w:rFonts w:ascii="Times New Roman" w:eastAsia="Times New Roman" w:hAnsi="Times New Roman" w:cs="Times New Roman"/>
+          <w:sz w:val="21"/>
+          <w:szCs w:val="21"/>
+        </w:rPr>
+        <w:t xml:space="preserve"> RFID pada ESP8266 </w:t>
+      </w:r>
+      <w:proofErr w:type="spellStart"/>
+      <w:r>
+        <w:rPr>
+          <w:rFonts w:ascii="Times New Roman" w:eastAsia="Times New Roman" w:hAnsi="Times New Roman" w:cs="Times New Roman"/>
+          <w:sz w:val="21"/>
+          <w:szCs w:val="21"/>
+        </w:rPr>
+        <w:t>menggunakan</w:t>
       </w:r>
       <w:proofErr w:type="spellEnd"/>
       <w:r>
@@ -804,43 +947,25 @@
           <w:sz w:val="21"/>
           <w:szCs w:val="21"/>
         </w:rPr>
-        <w:t>berbasis</w:t>
-      </w:r>
-      <w:proofErr w:type="spellEnd"/>
-      <w:r>
-        <w:rPr>
-          <w:rFonts w:ascii="Times New Roman" w:eastAsia="Times New Roman" w:hAnsi="Times New Roman" w:cs="Times New Roman"/>
-          <w:sz w:val="21"/>
-          <w:szCs w:val="21"/>
-        </w:rPr>
-        <w:t xml:space="preserve"> RFID </w:t>
-      </w:r>
-      <w:proofErr w:type="spellStart"/>
-      <w:r>
-        <w:rPr>
-          <w:rFonts w:ascii="Times New Roman" w:eastAsia="Times New Roman" w:hAnsi="Times New Roman" w:cs="Times New Roman"/>
-          <w:sz w:val="21"/>
-          <w:szCs w:val="21"/>
-        </w:rPr>
-        <w:t>menggunakan</w:t>
-      </w:r>
-      <w:proofErr w:type="spellEnd"/>
-      <w:r>
-        <w:rPr>
-          <w:rFonts w:ascii="Times New Roman" w:eastAsia="Times New Roman" w:hAnsi="Times New Roman" w:cs="Times New Roman"/>
-          <w:sz w:val="21"/>
-          <w:szCs w:val="21"/>
-        </w:rPr>
-        <w:t xml:space="preserve"> ESP8266 yang </w:t>
-      </w:r>
-      <w:proofErr w:type="spellStart"/>
-      <w:r>
-        <w:rPr>
-          <w:rFonts w:ascii="Times New Roman" w:eastAsia="Times New Roman" w:hAnsi="Times New Roman" w:cs="Times New Roman"/>
-          <w:sz w:val="21"/>
-          <w:szCs w:val="21"/>
-        </w:rPr>
-        <w:t>terkoneksi</w:t>
+        <w:t>pemrograman</w:t>
+      </w:r>
+      <w:proofErr w:type="spellEnd"/>
+      <w:r>
+        <w:rPr>
+          <w:rFonts w:ascii="Times New Roman" w:eastAsia="Times New Roman" w:hAnsi="Times New Roman" w:cs="Times New Roman"/>
+          <w:sz w:val="21"/>
+          <w:szCs w:val="21"/>
+        </w:rPr>
+        <w:t xml:space="preserve"> C/C++ </w:t>
+      </w:r>
+      <w:proofErr w:type="spellStart"/>
+      <w:r>
+        <w:rPr>
+          <w:rFonts w:ascii="Times New Roman" w:eastAsia="Times New Roman" w:hAnsi="Times New Roman" w:cs="Times New Roman"/>
+          <w:sz w:val="21"/>
+          <w:szCs w:val="21"/>
+        </w:rPr>
+        <w:t>untuk</w:t>
       </w:r>
       <w:proofErr w:type="spellEnd"/>
       <w:r>
@@ -858,6 +983,114 @@
           <w:sz w:val="21"/>
           <w:szCs w:val="21"/>
         </w:rPr>
+        <w:t>autentikasi</w:t>
+      </w:r>
+      <w:proofErr w:type="spellEnd"/>
+      <w:r>
+        <w:rPr>
+          <w:rFonts w:ascii="Times New Roman" w:eastAsia="Times New Roman" w:hAnsi="Times New Roman" w:cs="Times New Roman"/>
+          <w:sz w:val="21"/>
+          <w:szCs w:val="21"/>
+        </w:rPr>
+        <w:t xml:space="preserve"> </w:t>
+      </w:r>
+      <w:proofErr w:type="spellStart"/>
+      <w:r>
+        <w:rPr>
+          <w:rFonts w:ascii="Times New Roman" w:eastAsia="Times New Roman" w:hAnsi="Times New Roman" w:cs="Times New Roman"/>
+          <w:sz w:val="21"/>
+          <w:szCs w:val="21"/>
+        </w:rPr>
+        <w:t>fisik</w:t>
+      </w:r>
+      <w:proofErr w:type="spellEnd"/>
+      <w:r>
+        <w:rPr>
+          <w:rFonts w:ascii="Times New Roman" w:eastAsia="Times New Roman" w:hAnsi="Times New Roman" w:cs="Times New Roman"/>
+          <w:sz w:val="21"/>
+          <w:szCs w:val="21"/>
+        </w:rPr>
+        <w:t xml:space="preserve">, </w:t>
+      </w:r>
+      <w:proofErr w:type="spellStart"/>
+      <w:r>
+        <w:rPr>
+          <w:rFonts w:ascii="Times New Roman" w:eastAsia="Times New Roman" w:hAnsi="Times New Roman" w:cs="Times New Roman"/>
+          <w:sz w:val="21"/>
+          <w:szCs w:val="21"/>
+        </w:rPr>
+        <w:t>dengan</w:t>
+      </w:r>
+      <w:proofErr w:type="spellEnd"/>
+      <w:r>
+        <w:rPr>
+          <w:rFonts w:ascii="Times New Roman" w:eastAsia="Times New Roman" w:hAnsi="Times New Roman" w:cs="Times New Roman"/>
+          <w:sz w:val="21"/>
+          <w:szCs w:val="21"/>
+        </w:rPr>
+        <w:t xml:space="preserve"> </w:t>
+      </w:r>
+      <w:proofErr w:type="spellStart"/>
+      <w:r>
+        <w:rPr>
+          <w:rFonts w:ascii="Times New Roman" w:eastAsia="Times New Roman" w:hAnsi="Times New Roman" w:cs="Times New Roman"/>
+          <w:sz w:val="21"/>
+          <w:szCs w:val="21"/>
+        </w:rPr>
+        <w:t>integrasi</w:t>
+      </w:r>
+      <w:proofErr w:type="spellEnd"/>
+      <w:r>
+        <w:rPr>
+          <w:rFonts w:ascii="Times New Roman" w:eastAsia="Times New Roman" w:hAnsi="Times New Roman" w:cs="Times New Roman"/>
+          <w:sz w:val="21"/>
+          <w:szCs w:val="21"/>
+        </w:rPr>
+        <w:t xml:space="preserve"> </w:t>
+      </w:r>
+      <w:proofErr w:type="spellStart"/>
+      <w:r>
+        <w:rPr>
+          <w:rFonts w:ascii="Times New Roman" w:eastAsia="Times New Roman" w:hAnsi="Times New Roman" w:cs="Times New Roman"/>
+          <w:sz w:val="21"/>
+          <w:szCs w:val="21"/>
+        </w:rPr>
+        <w:t>pengiriman</w:t>
+      </w:r>
+      <w:proofErr w:type="spellEnd"/>
+      <w:r>
+        <w:rPr>
+          <w:rFonts w:ascii="Times New Roman" w:eastAsia="Times New Roman" w:hAnsi="Times New Roman" w:cs="Times New Roman"/>
+          <w:sz w:val="21"/>
+          <w:szCs w:val="21"/>
+        </w:rPr>
+        <w:t xml:space="preserve"> data </w:t>
+      </w:r>
+      <w:proofErr w:type="spellStart"/>
+      <w:r>
+        <w:rPr>
+          <w:rFonts w:ascii="Times New Roman" w:eastAsia="Times New Roman" w:hAnsi="Times New Roman" w:cs="Times New Roman"/>
+          <w:sz w:val="21"/>
+          <w:szCs w:val="21"/>
+        </w:rPr>
+        <w:t>kehadiran</w:t>
+      </w:r>
+      <w:proofErr w:type="spellEnd"/>
+      <w:r>
+        <w:rPr>
+          <w:rFonts w:ascii="Times New Roman" w:eastAsia="Times New Roman" w:hAnsi="Times New Roman" w:cs="Times New Roman"/>
+          <w:sz w:val="21"/>
+          <w:szCs w:val="21"/>
+        </w:rPr>
+        <w:t xml:space="preserve"> </w:t>
+      </w:r>
+      <w:proofErr w:type="spellStart"/>
+      <w:r>
+        <w:rPr>
+          <w:rFonts w:ascii="Times New Roman" w:eastAsia="Times New Roman" w:hAnsi="Times New Roman" w:cs="Times New Roman"/>
+          <w:sz w:val="21"/>
+          <w:szCs w:val="21"/>
+        </w:rPr>
         <w:t>secara</w:t>
       </w:r>
       <w:proofErr w:type="spellEnd"/>
@@ -867,7 +1100,25 @@
           <w:sz w:val="21"/>
           <w:szCs w:val="21"/>
         </w:rPr>
-        <w:t xml:space="preserve"> real-time </w:t>
+        <w:t xml:space="preserve"> </w:t>
+      </w:r>
+      <w:r>
+        <w:rPr>
+          <w:rFonts w:ascii="Times New Roman" w:eastAsia="Times New Roman" w:hAnsi="Times New Roman" w:cs="Times New Roman"/>
+          <w:i/>
+          <w:iCs/>
+          <w:sz w:val="21"/>
+          <w:szCs w:val="21"/>
+        </w:rPr>
+        <w:t>real-time</w:t>
+      </w:r>
+      <w:r>
+        <w:rPr>
+          <w:rFonts w:ascii="Times New Roman" w:eastAsia="Times New Roman" w:hAnsi="Times New Roman" w:cs="Times New Roman"/>
+          <w:sz w:val="21"/>
+          <w:szCs w:val="21"/>
+        </w:rPr>
+        <w:t xml:space="preserve"> </w:t>
       </w:r>
       <w:proofErr w:type="spellStart"/>
       <w:r>
@@ -885,7 +1136,25 @@
           <w:sz w:val="21"/>
           <w:szCs w:val="21"/>
         </w:rPr>
-        <w:t xml:space="preserve"> website </w:t>
+        <w:t xml:space="preserve"> </w:t>
+      </w:r>
+      <w:r>
+        <w:rPr>
+          <w:rFonts w:ascii="Times New Roman" w:eastAsia="Times New Roman" w:hAnsi="Times New Roman" w:cs="Times New Roman"/>
+          <w:i/>
+          <w:iCs/>
+          <w:sz w:val="21"/>
+          <w:szCs w:val="21"/>
+        </w:rPr>
+        <w:t>website</w:t>
+      </w:r>
+      <w:r>
+        <w:rPr>
+          <w:rFonts w:ascii="Times New Roman" w:eastAsia="Times New Roman" w:hAnsi="Times New Roman" w:cs="Times New Roman"/>
+          <w:sz w:val="21"/>
+          <w:szCs w:val="21"/>
+        </w:rPr>
+        <w:t xml:space="preserve"> </w:t>
       </w:r>
       <w:proofErr w:type="spellStart"/>
       <w:r>
@@ -908,73 +1177,93 @@
     </w:p>
     <w:p>
       <w:pPr>
-        <w:numPr>
-          <w:ilvl w:val="0"/>
-          <w:numId w:val="2"/>
-        </w:numPr>
         <w:tabs>
           <w:tab w:val="left" w:pos="284"/>
-          <w:tab w:val="left" w:pos="630"/>
+          <w:tab w:val="left" w:pos="709"/>
         </w:tabs>
         <w:rPr>
           <w:rFonts w:ascii="Times New Roman" w:eastAsia="Times New Roman" w:hAnsi="Times New Roman" w:cs="Times New Roman"/>
-          <w:sz w:val="21"/>
-          <w:szCs w:val="21"/>
-          <w:lang w:val="sv-SE"/>
-        </w:rPr>
-      </w:pPr>
-      <w:r>
-        <w:rPr>
-          <w:rFonts w:ascii="Times New Roman" w:eastAsia="Times New Roman" w:hAnsi="Times New Roman" w:cs="Times New Roman"/>
-          <w:sz w:val="21"/>
-          <w:szCs w:val="21"/>
-          <w:lang w:val="sv-SE"/>
-        </w:rPr>
-        <w:t>Memanfaatkan kartu identitas siswa sebagai media autentikasi kehadiran.</w:t>
-      </w:r>
-    </w:p>
-    <w:p>
-      <w:pPr>
-        <w:tabs>
-          <w:tab w:val="left" w:pos="900"/>
-        </w:tabs>
-        <w:rPr>
-          <w:rFonts w:ascii="Times New Roman" w:eastAsia="Times New Roman" w:hAnsi="Times New Roman" w:cs="Times New Roman"/>
-          <w:sz w:val="21"/>
-          <w:szCs w:val="21"/>
-        </w:rPr>
-      </w:pPr>
-      <w:r>
-        <w:rPr>
-          <w:rFonts w:ascii="Times New Roman" w:eastAsia="Times New Roman" w:hAnsi="Times New Roman" w:cs="Times New Roman"/>
-          <w:b/>
-          <w:bCs/>
-          <w:sz w:val="21"/>
-          <w:szCs w:val="21"/>
-        </w:rPr>
-        <w:t>SMAPAR (</w:t>
-      </w:r>
-      <w:r>
-        <w:rPr>
-          <w:rFonts w:ascii="Times New Roman" w:eastAsia="Times New Roman" w:hAnsi="Times New Roman" w:cs="Times New Roman"/>
-          <w:b/>
-          <w:bCs/>
-          <w:i/>
-          <w:iCs/>
-          <w:sz w:val="21"/>
-          <w:szCs w:val="21"/>
-        </w:rPr>
-        <w:t>Smart Parking System</w:t>
-      </w:r>
-      <w:r>
-        <w:rPr>
-          <w:rFonts w:ascii="Times New Roman" w:eastAsia="Times New Roman" w:hAnsi="Times New Roman" w:cs="Times New Roman"/>
-          <w:b/>
-          <w:bCs/>
-          <w:sz w:val="21"/>
-          <w:szCs w:val="21"/>
-        </w:rPr>
-        <w:t>).</w:t>
+          <w:b/>
+          <w:bCs/>
+          <w:sz w:val="21"/>
+          <w:szCs w:val="21"/>
+        </w:rPr>
+      </w:pPr>
+      <w:r>
+        <w:rPr>
+          <w:rFonts w:ascii="Times New Roman" w:eastAsia="Times New Roman" w:hAnsi="Times New Roman" w:cs="Times New Roman"/>
+          <w:b/>
+          <w:bCs/>
+          <w:sz w:val="21"/>
+          <w:szCs w:val="21"/>
+        </w:rPr>
+        <w:t xml:space="preserve">Door Lock Digital </w:t>
+      </w:r>
+      <w:proofErr w:type="spellStart"/>
+      <w:r>
+        <w:rPr>
+          <w:rFonts w:ascii="Times New Roman" w:eastAsia="Times New Roman" w:hAnsi="Times New Roman" w:cs="Times New Roman"/>
+          <w:b/>
+          <w:bCs/>
+          <w:sz w:val="21"/>
+          <w:szCs w:val="21"/>
+        </w:rPr>
+        <w:t>Berbasis</w:t>
+      </w:r>
+      <w:proofErr w:type="spellEnd"/>
+      <w:r>
+        <w:rPr>
+          <w:rFonts w:ascii="Times New Roman" w:eastAsia="Times New Roman" w:hAnsi="Times New Roman" w:cs="Times New Roman"/>
+          <w:b/>
+          <w:bCs/>
+          <w:sz w:val="21"/>
+          <w:szCs w:val="21"/>
+        </w:rPr>
+        <w:t xml:space="preserve"> </w:t>
+      </w:r>
+      <w:proofErr w:type="spellStart"/>
+      <w:r>
+        <w:rPr>
+          <w:rFonts w:ascii="Times New Roman" w:eastAsia="Times New Roman" w:hAnsi="Times New Roman" w:cs="Times New Roman"/>
+          <w:b/>
+          <w:bCs/>
+          <w:sz w:val="21"/>
+          <w:szCs w:val="21"/>
+        </w:rPr>
+        <w:t>Autentikasi</w:t>
+      </w:r>
+      <w:proofErr w:type="spellEnd"/>
+      <w:r>
+        <w:rPr>
+          <w:rFonts w:ascii="Times New Roman" w:eastAsia="Times New Roman" w:hAnsi="Times New Roman" w:cs="Times New Roman"/>
+          <w:b/>
+          <w:bCs/>
+          <w:sz w:val="21"/>
+          <w:szCs w:val="21"/>
+        </w:rPr>
+        <w:t xml:space="preserve"> </w:t>
+      </w:r>
+      <w:proofErr w:type="spellStart"/>
+      <w:r>
+        <w:rPr>
+          <w:rFonts w:ascii="Times New Roman" w:eastAsia="Times New Roman" w:hAnsi="Times New Roman" w:cs="Times New Roman"/>
+          <w:b/>
+          <w:bCs/>
+          <w:sz w:val="21"/>
+          <w:szCs w:val="21"/>
+        </w:rPr>
+        <w:t>Anggota</w:t>
+      </w:r>
+      <w:proofErr w:type="spellEnd"/>
+      <w:r>
+        <w:rPr>
+          <w:rFonts w:ascii="Times New Roman" w:eastAsia="Times New Roman" w:hAnsi="Times New Roman" w:cs="Times New Roman"/>
+          <w:b/>
+          <w:bCs/>
+          <w:sz w:val="21"/>
+          <w:szCs w:val="21"/>
+        </w:rPr>
+        <w:t xml:space="preserve"> OSIS.</w:t>
       </w:r>
       <w:r>
         <w:rPr>
@@ -994,7 +1283,7 @@
           <w:sz w:val="21"/>
           <w:szCs w:val="21"/>
         </w:rPr>
-        <w:t>Depok, Indonesia</w:t>
+        <w:t>Bekasi, Indonesia</w:t>
       </w:r>
     </w:p>
     <w:p>
@@ -1007,17 +1296,192 @@
           <w:rFonts w:ascii="Times New Roman" w:eastAsia="Times New Roman" w:hAnsi="Times New Roman" w:cs="Times New Roman"/>
           <w:b/>
           <w:bCs/>
-          <w:sz w:val="22"/>
-          <w:szCs w:val="22"/>
-        </w:rPr>
-      </w:pPr>
-      <w:r>
-        <w:rPr>
-          <w:rFonts w:ascii="Times New Roman" w:eastAsia="Times New Roman" w:hAnsi="Times New Roman" w:cs="Times New Roman"/>
-          <w:i/>
-          <w:iCs/>
-          <w:sz w:val="21"/>
-          <w:szCs w:val="21"/>
+          <w:i/>
+          <w:iCs/>
+          <w:sz w:val="21"/>
+          <w:szCs w:val="21"/>
+        </w:rPr>
+      </w:pPr>
+      <w:r>
+        <w:rPr>
+          <w:rFonts w:ascii="Times New Roman" w:eastAsia="Times New Roman" w:hAnsi="Times New Roman" w:cs="Times New Roman"/>
+          <w:i/>
+          <w:iCs/>
+          <w:sz w:val="21"/>
+          <w:szCs w:val="21"/>
+        </w:rPr>
+        <w:t>Project Developer</w:t>
+      </w:r>
+      <w:r>
+        <w:rPr>
+          <w:rFonts w:ascii="Times New Roman" w:eastAsia="Times New Roman" w:hAnsi="Times New Roman" w:cs="Times New Roman"/>
+          <w:i/>
+          <w:iCs/>
+          <w:sz w:val="21"/>
+          <w:szCs w:val="21"/>
+        </w:rPr>
+        <w:tab/>
+        <w:t xml:space="preserve">       </w:t>
+      </w:r>
+      <w:r>
+        <w:rPr>
+          <w:rFonts w:ascii="Times New Roman" w:eastAsia="Times New Roman" w:hAnsi="Times New Roman" w:cs="Times New Roman"/>
+          <w:b/>
+          <w:bCs/>
+          <w:i/>
+          <w:iCs/>
+          <w:sz w:val="21"/>
+          <w:szCs w:val="21"/>
+          <w:lang w:val="sv-SE"/>
+        </w:rPr>
+        <w:t>Agustus</w:t>
+      </w:r>
+      <w:r>
+        <w:rPr>
+          <w:rFonts w:ascii="Times New Roman" w:eastAsia="Times New Roman" w:hAnsi="Times New Roman" w:cs="Times New Roman"/>
+          <w:b/>
+          <w:bCs/>
+          <w:i/>
+          <w:iCs/>
+          <w:sz w:val="21"/>
+          <w:szCs w:val="21"/>
+          <w:lang w:val="sv-SE"/>
+        </w:rPr>
+        <w:t xml:space="preserve"> </w:t>
+      </w:r>
+      <w:r>
+        <w:rPr>
+          <w:rFonts w:ascii="Times New Roman" w:eastAsia="Times New Roman" w:hAnsi="Times New Roman" w:cs="Times New Roman"/>
+          <w:b/>
+          <w:bCs/>
+          <w:i/>
+          <w:iCs/>
+          <w:sz w:val="21"/>
+          <w:szCs w:val="21"/>
+        </w:rPr>
+        <w:t>2022 – Oktober 2022</w:t>
+      </w:r>
+    </w:p>
+    <w:p>
+      <w:pPr>
+        <w:pStyle w:val="ListParagraph"/>
+        <w:numPr>
+          <w:ilvl w:val="0"/>
+          <w:numId w:val="1"/>
+        </w:numPr>
+        <w:tabs>
+          <w:tab w:val="left" w:pos="900"/>
+        </w:tabs>
+        <w:rPr>
+          <w:rFonts w:ascii="Times New Roman" w:eastAsia="Times New Roman" w:hAnsi="Times New Roman" w:cs="Times New Roman"/>
+          <w:sz w:val="21"/>
+          <w:szCs w:val="21"/>
+          <w:lang w:val="sv-SE"/>
+        </w:rPr>
+      </w:pPr>
+      <w:r>
+        <w:rPr>
+          <w:rFonts w:ascii="Times New Roman" w:eastAsia="Times New Roman" w:hAnsi="Times New Roman" w:cs="Times New Roman"/>
+          <w:sz w:val="21"/>
+          <w:szCs w:val="21"/>
+          <w:lang w:val="sv-SE"/>
+        </w:rPr>
+        <w:t>Mendesain dan menyolder rangkaian sistem kunci pintu otomatis berbasis mikrokontroler, dengan penulisan kode C/C++ untuk mengatur logika pembatasan akses fisik secara aman.</w:t>
+      </w:r>
+    </w:p>
+    <w:p>
+      <w:pPr>
+        <w:tabs>
+          <w:tab w:val="left" w:pos="900"/>
+        </w:tabs>
+        <w:rPr>
+          <w:rFonts w:ascii="Times New Roman" w:eastAsia="Times New Roman" w:hAnsi="Times New Roman" w:cs="Times New Roman"/>
+          <w:sz w:val="21"/>
+          <w:szCs w:val="21"/>
+          <w:lang w:val="sv-SE"/>
+        </w:rPr>
+      </w:pPr>
+      <w:r>
+        <w:rPr>
+          <w:rFonts w:ascii="Times New Roman" w:eastAsia="Times New Roman" w:hAnsi="Times New Roman" w:cs="Times New Roman"/>
+          <w:b/>
+          <w:bCs/>
+          <w:sz w:val="21"/>
+          <w:szCs w:val="21"/>
+          <w:lang w:val="sv-SE"/>
+        </w:rPr>
+        <w:t>SMAPAR (</w:t>
+      </w:r>
+      <w:r>
+        <w:rPr>
+          <w:rFonts w:ascii="Times New Roman" w:eastAsia="Times New Roman" w:hAnsi="Times New Roman" w:cs="Times New Roman"/>
+          <w:b/>
+          <w:bCs/>
+          <w:i/>
+          <w:iCs/>
+          <w:sz w:val="21"/>
+          <w:szCs w:val="21"/>
+          <w:lang w:val="sv-SE"/>
+        </w:rPr>
+        <w:t>Smart Parking System</w:t>
+      </w:r>
+      <w:r>
+        <w:rPr>
+          <w:rFonts w:ascii="Times New Roman" w:eastAsia="Times New Roman" w:hAnsi="Times New Roman" w:cs="Times New Roman"/>
+          <w:b/>
+          <w:bCs/>
+          <w:sz w:val="21"/>
+          <w:szCs w:val="21"/>
+          <w:lang w:val="sv-SE"/>
+        </w:rPr>
+        <w:t>).</w:t>
+      </w:r>
+      <w:r>
+        <w:rPr>
+          <w:rFonts w:ascii="Times New Roman" w:eastAsia="Times New Roman" w:hAnsi="Times New Roman" w:cs="Times New Roman"/>
+          <w:b/>
+          <w:bCs/>
+          <w:sz w:val="22"/>
+          <w:szCs w:val="22"/>
+          <w:lang w:val="sv-SE"/>
+        </w:rPr>
+        <w:t xml:space="preserve"> – </w:t>
+      </w:r>
+      <w:r>
+        <w:rPr>
+          <w:rFonts w:ascii="Times New Roman" w:eastAsia="Times New Roman" w:hAnsi="Times New Roman" w:cs="Times New Roman"/>
+          <w:b/>
+          <w:bCs/>
+          <w:sz w:val="21"/>
+          <w:szCs w:val="21"/>
+          <w:lang w:val="sv-SE"/>
+        </w:rPr>
+        <w:t>Depok, Indonesia</w:t>
+      </w:r>
+    </w:p>
+    <w:p>
+      <w:pPr>
+        <w:tabs>
+          <w:tab w:val="left" w:pos="1134"/>
+          <w:tab w:val="right" w:pos="10503"/>
+        </w:tabs>
+        <w:rPr>
+          <w:rFonts w:ascii="Times New Roman" w:eastAsia="Times New Roman" w:hAnsi="Times New Roman" w:cs="Times New Roman"/>
+          <w:b/>
+          <w:bCs/>
+          <w:sz w:val="22"/>
+          <w:szCs w:val="22"/>
+          <w:lang w:val="sv-SE"/>
+        </w:rPr>
+      </w:pPr>
+      <w:r>
+        <w:rPr>
+          <w:rFonts w:ascii="Times New Roman" w:eastAsia="Times New Roman" w:hAnsi="Times New Roman" w:cs="Times New Roman"/>
+          <w:i/>
+          <w:iCs/>
+          <w:sz w:val="21"/>
+          <w:szCs w:val="21"/>
+          <w:lang w:val="sv-SE"/>
         </w:rPr>
         <w:t>IoT &amp; Back-End Developer</w:t>
       </w:r>
@@ -1029,6 +1493,7 @@
           <w:smallCaps/>
           <w:sz w:val="22"/>
           <w:szCs w:val="22"/>
+          <w:lang w:val="sv-SE"/>
         </w:rPr>
         <w:tab/>
       </w:r>
@@ -1041,8 +1506,48 @@
           <w:iCs/>
           <w:sz w:val="21"/>
           <w:szCs w:val="21"/>
-        </w:rPr>
-        <w:t>June 2024 – Jan2025</w:t>
+          <w:lang w:val="sv-SE"/>
+        </w:rPr>
+        <w:t xml:space="preserve">Juni </w:t>
+      </w:r>
+      <w:r>
+        <w:rPr>
+          <w:rFonts w:ascii="Times New Roman" w:eastAsia="Times New Roman" w:hAnsi="Times New Roman" w:cs="Times New Roman"/>
+          <w:b/>
+          <w:bCs/>
+          <w:i/>
+          <w:iCs/>
+          <w:sz w:val="21"/>
+          <w:szCs w:val="21"/>
+          <w:lang w:val="sv-SE"/>
+        </w:rPr>
+        <w:t xml:space="preserve">2024 – </w:t>
+      </w:r>
+      <w:r>
+        <w:rPr>
+          <w:rFonts w:ascii="Times New Roman" w:eastAsia="Times New Roman" w:hAnsi="Times New Roman" w:cs="Times New Roman"/>
+          <w:b/>
+          <w:bCs/>
+          <w:i/>
+          <w:iCs/>
+          <w:sz w:val="21"/>
+          <w:szCs w:val="21"/>
+          <w:lang w:val="sv-SE"/>
+        </w:rPr>
+        <w:t xml:space="preserve">Januari </w:t>
+      </w:r>
+      <w:r>
+        <w:rPr>
+          <w:rFonts w:ascii="Times New Roman" w:eastAsia="Times New Roman" w:hAnsi="Times New Roman" w:cs="Times New Roman"/>
+          <w:b/>
+          <w:bCs/>
+          <w:i/>
+          <w:iCs/>
+          <w:sz w:val="21"/>
+          <w:szCs w:val="21"/>
+          <w:lang w:val="sv-SE"/>
+        </w:rPr>
+        <w:t>2025</w:t>
       </w:r>
     </w:p>
     <w:p>
@@ -1068,303 +1573,73 @@
           <w:szCs w:val="21"/>
           <w:lang w:val="sv-SE"/>
         </w:rPr>
-        <w:t>Mengembangkan sistem parkir mobil pintar berbasis IoT.</w:t>
+        <w:t xml:space="preserve">Merancang </w:t>
+      </w:r>
+      <w:r>
+        <w:rPr>
+          <w:rFonts w:ascii="Times New Roman" w:eastAsia="Times New Roman" w:hAnsi="Times New Roman" w:cs="Times New Roman"/>
+          <w:i/>
+          <w:iCs/>
+          <w:sz w:val="21"/>
+          <w:szCs w:val="21"/>
+          <w:lang w:val="sv-SE"/>
+        </w:rPr>
+        <w:t>hardware</w:t>
+      </w:r>
+      <w:r>
+        <w:rPr>
+          <w:rFonts w:ascii="Times New Roman" w:eastAsia="Times New Roman" w:hAnsi="Times New Roman" w:cs="Times New Roman"/>
+          <w:sz w:val="21"/>
+          <w:szCs w:val="21"/>
+          <w:lang w:val="sv-SE"/>
+        </w:rPr>
+        <w:t xml:space="preserve"> sensor parkir dan memprogram mikrokontroler menggunakan C/C++ untuk deteksi fisik kendaraan, dengan integrasi pengiriman data telemetri ke sistem </w:t>
+      </w:r>
+      <w:r>
+        <w:rPr>
+          <w:rFonts w:ascii="Times New Roman" w:eastAsia="Times New Roman" w:hAnsi="Times New Roman" w:cs="Times New Roman"/>
+          <w:i/>
+          <w:iCs/>
+          <w:sz w:val="21"/>
+          <w:szCs w:val="21"/>
+          <w:lang w:val="sv-SE"/>
+        </w:rPr>
+        <w:t>backend web</w:t>
+      </w:r>
+      <w:r>
+        <w:rPr>
+          <w:rFonts w:ascii="Times New Roman" w:eastAsia="Times New Roman" w:hAnsi="Times New Roman" w:cs="Times New Roman"/>
+          <w:sz w:val="21"/>
+          <w:szCs w:val="21"/>
+          <w:lang w:val="sv-SE"/>
+        </w:rPr>
+        <w:t xml:space="preserve"> Flask.</w:t>
       </w:r>
     </w:p>
     <w:p>
       <w:pPr>
-        <w:numPr>
-          <w:ilvl w:val="0"/>
-          <w:numId w:val="4"/>
-        </w:numPr>
         <w:tabs>
           <w:tab w:val="left" w:pos="95"/>
         </w:tabs>
         <w:rPr>
           <w:rFonts w:ascii="Times New Roman" w:eastAsia="Times New Roman" w:hAnsi="Times New Roman" w:cs="Times New Roman"/>
-          <w:sz w:val="21"/>
-          <w:szCs w:val="21"/>
-        </w:rPr>
-      </w:pPr>
-      <w:proofErr w:type="spellStart"/>
-      <w:r>
-        <w:rPr>
-          <w:rFonts w:ascii="Times New Roman" w:eastAsia="Times New Roman" w:hAnsi="Times New Roman" w:cs="Times New Roman"/>
-          <w:sz w:val="21"/>
-          <w:szCs w:val="21"/>
-        </w:rPr>
-        <w:t>Bertanggung</w:t>
-      </w:r>
-      <w:proofErr w:type="spellEnd"/>
-      <w:r>
-        <w:rPr>
-          <w:rFonts w:ascii="Times New Roman" w:eastAsia="Times New Roman" w:hAnsi="Times New Roman" w:cs="Times New Roman"/>
-          <w:sz w:val="21"/>
-          <w:szCs w:val="21"/>
-        </w:rPr>
-        <w:t xml:space="preserve"> </w:t>
-      </w:r>
-      <w:proofErr w:type="spellStart"/>
-      <w:r>
-        <w:rPr>
-          <w:rFonts w:ascii="Times New Roman" w:eastAsia="Times New Roman" w:hAnsi="Times New Roman" w:cs="Times New Roman"/>
-          <w:sz w:val="21"/>
-          <w:szCs w:val="21"/>
-        </w:rPr>
-        <w:t>jawab</w:t>
-      </w:r>
-      <w:proofErr w:type="spellEnd"/>
-      <w:r>
-        <w:rPr>
-          <w:rFonts w:ascii="Times New Roman" w:eastAsia="Times New Roman" w:hAnsi="Times New Roman" w:cs="Times New Roman"/>
-          <w:sz w:val="21"/>
-          <w:szCs w:val="21"/>
-        </w:rPr>
-        <w:t xml:space="preserve"> </w:t>
-      </w:r>
-      <w:proofErr w:type="spellStart"/>
-      <w:r>
-        <w:rPr>
-          <w:rFonts w:ascii="Times New Roman" w:eastAsia="Times New Roman" w:hAnsi="Times New Roman" w:cs="Times New Roman"/>
-          <w:sz w:val="21"/>
-          <w:szCs w:val="21"/>
-        </w:rPr>
-        <w:t>atas</w:t>
-      </w:r>
-      <w:proofErr w:type="spellEnd"/>
-      <w:r>
-        <w:rPr>
-          <w:rFonts w:ascii="Times New Roman" w:eastAsia="Times New Roman" w:hAnsi="Times New Roman" w:cs="Times New Roman"/>
-          <w:sz w:val="21"/>
-          <w:szCs w:val="21"/>
-        </w:rPr>
-        <w:t xml:space="preserve"> </w:t>
-      </w:r>
-      <w:proofErr w:type="spellStart"/>
-      <w:r>
-        <w:rPr>
-          <w:rFonts w:ascii="Times New Roman" w:eastAsia="Times New Roman" w:hAnsi="Times New Roman" w:cs="Times New Roman"/>
-          <w:sz w:val="21"/>
-          <w:szCs w:val="21"/>
-        </w:rPr>
-        <w:t>komunikasi</w:t>
-      </w:r>
-      <w:proofErr w:type="spellEnd"/>
-      <w:r>
-        <w:rPr>
-          <w:rFonts w:ascii="Times New Roman" w:eastAsia="Times New Roman" w:hAnsi="Times New Roman" w:cs="Times New Roman"/>
-          <w:sz w:val="21"/>
-          <w:szCs w:val="21"/>
-        </w:rPr>
-        <w:t xml:space="preserve"> </w:t>
-      </w:r>
-      <w:proofErr w:type="spellStart"/>
-      <w:r>
-        <w:rPr>
-          <w:rFonts w:ascii="Times New Roman" w:eastAsia="Times New Roman" w:hAnsi="Times New Roman" w:cs="Times New Roman"/>
-          <w:sz w:val="21"/>
-          <w:szCs w:val="21"/>
-        </w:rPr>
-        <w:t>antara</w:t>
-      </w:r>
-      <w:proofErr w:type="spellEnd"/>
-      <w:r>
-        <w:rPr>
-          <w:rFonts w:ascii="Times New Roman" w:eastAsia="Times New Roman" w:hAnsi="Times New Roman" w:cs="Times New Roman"/>
-          <w:sz w:val="21"/>
-          <w:szCs w:val="21"/>
-        </w:rPr>
-        <w:t xml:space="preserve"> Flask dan MQTT </w:t>
-      </w:r>
-      <w:proofErr w:type="spellStart"/>
-      <w:r>
-        <w:rPr>
-          <w:rFonts w:ascii="Times New Roman" w:eastAsia="Times New Roman" w:hAnsi="Times New Roman" w:cs="Times New Roman"/>
-          <w:sz w:val="21"/>
-          <w:szCs w:val="21"/>
-        </w:rPr>
-        <w:t>untuk</w:t>
-      </w:r>
-      <w:proofErr w:type="spellEnd"/>
-      <w:r>
-        <w:rPr>
-          <w:rFonts w:ascii="Times New Roman" w:eastAsia="Times New Roman" w:hAnsi="Times New Roman" w:cs="Times New Roman"/>
-          <w:sz w:val="21"/>
-          <w:szCs w:val="21"/>
-        </w:rPr>
-        <w:t xml:space="preserve"> </w:t>
-      </w:r>
-      <w:proofErr w:type="spellStart"/>
-      <w:r>
-        <w:rPr>
-          <w:rFonts w:ascii="Times New Roman" w:eastAsia="Times New Roman" w:hAnsi="Times New Roman" w:cs="Times New Roman"/>
-          <w:sz w:val="21"/>
-          <w:szCs w:val="21"/>
-        </w:rPr>
-        <w:t>pengiriman</w:t>
-      </w:r>
-      <w:proofErr w:type="spellEnd"/>
-      <w:r>
-        <w:rPr>
-          <w:rFonts w:ascii="Times New Roman" w:eastAsia="Times New Roman" w:hAnsi="Times New Roman" w:cs="Times New Roman"/>
-          <w:sz w:val="21"/>
-          <w:szCs w:val="21"/>
-        </w:rPr>
-        <w:t xml:space="preserve"> data sensor </w:t>
-      </w:r>
-      <w:proofErr w:type="spellStart"/>
-      <w:r>
-        <w:rPr>
-          <w:rFonts w:ascii="Times New Roman" w:eastAsia="Times New Roman" w:hAnsi="Times New Roman" w:cs="Times New Roman"/>
-          <w:sz w:val="21"/>
-          <w:szCs w:val="21"/>
-        </w:rPr>
-        <w:t>secara</w:t>
-      </w:r>
-      <w:proofErr w:type="spellEnd"/>
-      <w:r>
-        <w:rPr>
-          <w:rFonts w:ascii="Times New Roman" w:eastAsia="Times New Roman" w:hAnsi="Times New Roman" w:cs="Times New Roman"/>
-          <w:sz w:val="21"/>
-          <w:szCs w:val="21"/>
-        </w:rPr>
-        <w:t xml:space="preserve"> real-time.</w:t>
-      </w:r>
-    </w:p>
-    <w:p>
-      <w:pPr>
-        <w:numPr>
-          <w:ilvl w:val="0"/>
-          <w:numId w:val="4"/>
-        </w:numPr>
-        <w:tabs>
-          <w:tab w:val="left" w:pos="95"/>
-        </w:tabs>
-        <w:rPr>
-          <w:rFonts w:ascii="Times New Roman" w:eastAsia="Times New Roman" w:hAnsi="Times New Roman" w:cs="Times New Roman"/>
-          <w:sz w:val="21"/>
-          <w:szCs w:val="21"/>
-          <w:lang w:val="sv-SE"/>
-        </w:rPr>
-      </w:pPr>
-      <w:r>
-        <w:rPr>
-          <w:rFonts w:ascii="Times New Roman" w:eastAsia="Times New Roman" w:hAnsi="Times New Roman" w:cs="Times New Roman"/>
-          <w:sz w:val="21"/>
-          <w:szCs w:val="21"/>
-          <w:lang w:val="sv-SE"/>
-        </w:rPr>
-        <w:t>Mendukung integrasi backend dengan sistem deteksi ketersediaan parkir.</w:t>
-      </w:r>
-    </w:p>
-    <w:p>
-      <w:pPr>
-        <w:tabs>
-          <w:tab w:val="left" w:pos="900"/>
-        </w:tabs>
-        <w:rPr>
-          <w:rFonts w:ascii="Times New Roman" w:eastAsia="Times New Roman" w:hAnsi="Times New Roman" w:cs="Times New Roman"/>
-          <w:b/>
-          <w:bCs/>
-          <w:sz w:val="21"/>
-          <w:szCs w:val="21"/>
-        </w:rPr>
-      </w:pPr>
-      <w:r>
-        <w:rPr>
-          <w:rFonts w:ascii="Times New Roman" w:eastAsia="Times New Roman" w:hAnsi="Times New Roman" w:cs="Times New Roman"/>
-          <w:b/>
-          <w:bCs/>
-          <w:sz w:val="21"/>
-          <w:szCs w:val="21"/>
-        </w:rPr>
-        <w:t xml:space="preserve">Door Lock Digital </w:t>
-      </w:r>
-      <w:proofErr w:type="spellStart"/>
-      <w:r>
-        <w:rPr>
-          <w:rFonts w:ascii="Times New Roman" w:eastAsia="Times New Roman" w:hAnsi="Times New Roman" w:cs="Times New Roman"/>
-          <w:b/>
-          <w:bCs/>
-          <w:sz w:val="21"/>
-          <w:szCs w:val="21"/>
-        </w:rPr>
-        <w:t>Berbasis</w:t>
-      </w:r>
-      <w:proofErr w:type="spellEnd"/>
-      <w:r>
-        <w:rPr>
-          <w:rFonts w:ascii="Times New Roman" w:eastAsia="Times New Roman" w:hAnsi="Times New Roman" w:cs="Times New Roman"/>
-          <w:b/>
-          <w:bCs/>
-          <w:sz w:val="21"/>
-          <w:szCs w:val="21"/>
-        </w:rPr>
-        <w:t xml:space="preserve"> </w:t>
-      </w:r>
-      <w:proofErr w:type="spellStart"/>
-      <w:r>
-        <w:rPr>
-          <w:rFonts w:ascii="Times New Roman" w:eastAsia="Times New Roman" w:hAnsi="Times New Roman" w:cs="Times New Roman"/>
-          <w:b/>
-          <w:bCs/>
-          <w:sz w:val="21"/>
-          <w:szCs w:val="21"/>
-        </w:rPr>
-        <w:t>Autentikasi</w:t>
-      </w:r>
-      <w:proofErr w:type="spellEnd"/>
-      <w:r>
-        <w:rPr>
-          <w:rFonts w:ascii="Times New Roman" w:eastAsia="Times New Roman" w:hAnsi="Times New Roman" w:cs="Times New Roman"/>
-          <w:b/>
-          <w:bCs/>
-          <w:sz w:val="21"/>
-          <w:szCs w:val="21"/>
-        </w:rPr>
-        <w:t xml:space="preserve"> </w:t>
-      </w:r>
-      <w:proofErr w:type="spellStart"/>
-      <w:r>
-        <w:rPr>
-          <w:rFonts w:ascii="Times New Roman" w:eastAsia="Times New Roman" w:hAnsi="Times New Roman" w:cs="Times New Roman"/>
-          <w:b/>
-          <w:bCs/>
-          <w:sz w:val="21"/>
-          <w:szCs w:val="21"/>
-        </w:rPr>
-        <w:t>Anggota</w:t>
-      </w:r>
-      <w:proofErr w:type="spellEnd"/>
-      <w:r>
-        <w:rPr>
-          <w:rFonts w:ascii="Times New Roman" w:eastAsia="Times New Roman" w:hAnsi="Times New Roman" w:cs="Times New Roman"/>
-          <w:b/>
-          <w:bCs/>
-          <w:sz w:val="21"/>
-          <w:szCs w:val="21"/>
-        </w:rPr>
-        <w:t xml:space="preserve"> OSIS.</w:t>
-      </w:r>
-      <w:r>
-        <w:rPr>
-          <w:rFonts w:ascii="Times New Roman" w:eastAsia="Times New Roman" w:hAnsi="Times New Roman" w:cs="Times New Roman"/>
-          <w:b/>
-          <w:bCs/>
-          <w:sz w:val="22"/>
-          <w:szCs w:val="22"/>
-        </w:rPr>
-        <w:t xml:space="preserve"> – </w:t>
-      </w:r>
-      <w:r>
-        <w:rPr>
-          <w:rFonts w:ascii="Times New Roman" w:eastAsia="Times New Roman" w:hAnsi="Times New Roman" w:cs="Times New Roman"/>
-          <w:b/>
-          <w:bCs/>
-          <w:sz w:val="21"/>
-          <w:szCs w:val="21"/>
-        </w:rPr>
-        <w:t>Bekasi, Indonesia</w:t>
+          <w:b/>
+          <w:bCs/>
+          <w:sz w:val="21"/>
+          <w:szCs w:val="21"/>
+          <w:lang w:val="en-ID"/>
+        </w:rPr>
+      </w:pPr>
+      <w:r>
+        <w:rPr>
+          <w:rFonts w:ascii="Times New Roman" w:eastAsia="Times New Roman" w:hAnsi="Times New Roman" w:cs="Times New Roman"/>
+          <w:b/>
+          <w:bCs/>
+          <w:sz w:val="21"/>
+          <w:szCs w:val="21"/>
+          <w:lang w:val="en-ID"/>
+        </w:rPr>
+        <w:t>Sistem Monitoring Pertanian Berbasis Drone. – Depok, Indonesia</w:t>
       </w:r>
     </w:p>
     <w:p>
@@ -1391,7 +1666,7 @@
           <w:sz w:val="21"/>
           <w:szCs w:val="21"/>
         </w:rPr>
-        <w:t>Project Developer</w:t>
+        <w:t>Hardware Engineer / Project Developer</w:t>
       </w:r>
       <w:r>
         <w:rPr>
@@ -1402,28 +1677,33 @@
           <w:szCs w:val="21"/>
         </w:rPr>
         <w:tab/>
-      </w:r>
-      <w:r>
-        <w:rPr>
-          <w:rFonts w:ascii="Times New Roman" w:eastAsia="Times New Roman" w:hAnsi="Times New Roman" w:cs="Times New Roman"/>
-          <w:i/>
-          <w:iCs/>
-          <w:sz w:val="21"/>
-          <w:szCs w:val="21"/>
-        </w:rPr>
         <w:t xml:space="preserve">       </w:t>
       </w:r>
-      <w:r>
-        <w:rPr>
-          <w:rFonts w:ascii="Times New Roman" w:eastAsia="Times New Roman" w:hAnsi="Times New Roman" w:cs="Times New Roman"/>
-          <w:b/>
-          <w:bCs/>
-          <w:i/>
-          <w:iCs/>
-          <w:sz w:val="21"/>
-          <w:szCs w:val="21"/>
-        </w:rPr>
-        <w:t>Augustus 2022 – Oktober 2022</w:t>
+      <w:proofErr w:type="spellStart"/>
+      <w:r>
+        <w:rPr>
+          <w:rFonts w:ascii="Times New Roman" w:eastAsia="Times New Roman" w:hAnsi="Times New Roman" w:cs="Times New Roman"/>
+          <w:b/>
+          <w:bCs/>
+          <w:i/>
+          <w:iCs/>
+          <w:sz w:val="21"/>
+          <w:szCs w:val="21"/>
+        </w:rPr>
+        <w:t>Februari</w:t>
+      </w:r>
+      <w:proofErr w:type="spellEnd"/>
+      <w:r>
+        <w:rPr>
+          <w:rFonts w:ascii="Times New Roman" w:eastAsia="Times New Roman" w:hAnsi="Times New Roman" w:cs="Times New Roman"/>
+          <w:b/>
+          <w:bCs/>
+          <w:i/>
+          <w:iCs/>
+          <w:sz w:val="21"/>
+          <w:szCs w:val="21"/>
+        </w:rPr>
+        <w:t xml:space="preserve"> 2026 – Juli 2026</w:t>
       </w:r>
     </w:p>
     <w:p>
@@ -1438,100 +1718,25 @@
         </w:tabs>
         <w:rPr>
           <w:rFonts w:ascii="Times New Roman" w:eastAsia="Times New Roman" w:hAnsi="Times New Roman" w:cs="Times New Roman"/>
-          <w:sz w:val="21"/>
-          <w:szCs w:val="21"/>
-          <w:lang w:val="sv-SE"/>
-        </w:rPr>
-      </w:pPr>
-      <w:r>
-        <w:rPr>
-          <w:rFonts w:ascii="Times New Roman" w:eastAsia="Times New Roman" w:hAnsi="Times New Roman" w:cs="Times New Roman"/>
-          <w:sz w:val="21"/>
-          <w:szCs w:val="21"/>
-          <w:lang w:val="sv-SE"/>
-        </w:rPr>
-        <w:t>Mendesain sistem kunci pintu otomatis berbasis mikrokontroler.</w:t>
-      </w:r>
-    </w:p>
-    <w:p>
-      <w:pPr>
-        <w:numPr>
-          <w:ilvl w:val="0"/>
-          <w:numId w:val="1"/>
-        </w:numPr>
-        <w:tabs>
-          <w:tab w:val="left" w:pos="1134"/>
-          <w:tab w:val="right" w:pos="10503"/>
-        </w:tabs>
-        <w:rPr>
-          <w:rFonts w:ascii="Times New Roman" w:eastAsia="Times New Roman" w:hAnsi="Times New Roman" w:cs="Times New Roman"/>
-          <w:sz w:val="21"/>
-          <w:szCs w:val="21"/>
-          <w:lang w:val="sv-SE"/>
-        </w:rPr>
-      </w:pPr>
-      <w:r>
-        <w:rPr>
-          <w:rFonts w:ascii="Times New Roman" w:eastAsia="Times New Roman" w:hAnsi="Times New Roman" w:cs="Times New Roman"/>
-          <w:sz w:val="21"/>
-          <w:szCs w:val="21"/>
-          <w:lang w:val="sv-SE"/>
-        </w:rPr>
-        <w:t>Membatasi akses hanya untuk anggota OSIS yang terdaftar guna menjaga keamanan aset organisasi.</w:t>
-      </w:r>
-    </w:p>
-    <w:p>
-      <w:pPr>
-        <w:tabs>
-          <w:tab w:val="left" w:pos="900"/>
-        </w:tabs>
-        <w:rPr>
-          <w:rFonts w:ascii="Times New Roman" w:eastAsia="Times New Roman" w:hAnsi="Times New Roman" w:cs="Times New Roman"/>
-          <w:sz w:val="21"/>
-          <w:szCs w:val="21"/>
-        </w:rPr>
-      </w:pPr>
-      <w:proofErr w:type="spellStart"/>
-      <w:r>
-        <w:rPr>
-          <w:rFonts w:ascii="Times New Roman" w:eastAsia="Times New Roman" w:hAnsi="Times New Roman" w:cs="Times New Roman"/>
-          <w:b/>
-          <w:bCs/>
-          <w:sz w:val="21"/>
-          <w:szCs w:val="21"/>
-        </w:rPr>
-        <w:t>Simulasi</w:t>
-      </w:r>
-      <w:proofErr w:type="spellEnd"/>
-      <w:r>
-        <w:rPr>
-          <w:rFonts w:ascii="Times New Roman" w:eastAsia="Times New Roman" w:hAnsi="Times New Roman" w:cs="Times New Roman"/>
-          <w:b/>
-          <w:bCs/>
-          <w:sz w:val="21"/>
-          <w:szCs w:val="21"/>
-        </w:rPr>
-        <w:t xml:space="preserve"> Jammer </w:t>
-      </w:r>
-      <w:proofErr w:type="spellStart"/>
-      <w:r>
-        <w:rPr>
-          <w:rFonts w:ascii="Times New Roman" w:eastAsia="Times New Roman" w:hAnsi="Times New Roman" w:cs="Times New Roman"/>
-          <w:b/>
-          <w:bCs/>
-          <w:sz w:val="21"/>
-          <w:szCs w:val="21"/>
-        </w:rPr>
-        <w:t>Sinyal</w:t>
-      </w:r>
-      <w:proofErr w:type="spellEnd"/>
-      <w:r>
-        <w:rPr>
-          <w:rFonts w:ascii="Times New Roman" w:eastAsia="Times New Roman" w:hAnsi="Times New Roman" w:cs="Times New Roman"/>
-          <w:b/>
-          <w:bCs/>
-          <w:sz w:val="21"/>
-          <w:szCs w:val="21"/>
+          <w:sz w:val="22"/>
+          <w:szCs w:val="22"/>
+        </w:rPr>
+      </w:pPr>
+      <w:proofErr w:type="spellStart"/>
+      <w:r>
+        <w:rPr>
+          <w:rFonts w:ascii="Times New Roman" w:eastAsia="Times New Roman" w:hAnsi="Times New Roman" w:cs="Times New Roman"/>
+          <w:sz w:val="22"/>
+          <w:szCs w:val="22"/>
+        </w:rPr>
+        <w:t>Membangun</w:t>
+      </w:r>
+      <w:proofErr w:type="spellEnd"/>
+      <w:r>
+        <w:rPr>
+          <w:rFonts w:ascii="Times New Roman" w:eastAsia="Times New Roman" w:hAnsi="Times New Roman" w:cs="Times New Roman"/>
+          <w:sz w:val="22"/>
+          <w:szCs w:val="22"/>
         </w:rPr>
         <w:t xml:space="preserve"> </w:t>
       </w:r>
@@ -1539,10 +1744,224 @@
       <w:r>
         <w:rPr>
           <w:rFonts w:ascii="Times New Roman" w:eastAsia="Times New Roman" w:hAnsi="Times New Roman" w:cs="Times New Roman"/>
-          <w:b/>
-          <w:bCs/>
-          <w:sz w:val="21"/>
-          <w:szCs w:val="21"/>
+          <w:sz w:val="22"/>
+          <w:szCs w:val="22"/>
+        </w:rPr>
+        <w:t>infrastruktur</w:t>
+      </w:r>
+      <w:proofErr w:type="spellEnd"/>
+      <w:r>
+        <w:rPr>
+          <w:rFonts w:ascii="Times New Roman" w:eastAsia="Times New Roman" w:hAnsi="Times New Roman" w:cs="Times New Roman"/>
+          <w:sz w:val="22"/>
+          <w:szCs w:val="22"/>
+        </w:rPr>
+        <w:t xml:space="preserve"> </w:t>
+      </w:r>
+      <w:proofErr w:type="spellStart"/>
+      <w:r>
+        <w:rPr>
+          <w:rFonts w:ascii="Times New Roman" w:eastAsia="Times New Roman" w:hAnsi="Times New Roman" w:cs="Times New Roman"/>
+          <w:sz w:val="22"/>
+          <w:szCs w:val="22"/>
+        </w:rPr>
+        <w:t>fisik</w:t>
+      </w:r>
+      <w:proofErr w:type="spellEnd"/>
+      <w:r>
+        <w:rPr>
+          <w:rFonts w:ascii="Times New Roman" w:eastAsia="Times New Roman" w:hAnsi="Times New Roman" w:cs="Times New Roman"/>
+          <w:sz w:val="22"/>
+          <w:szCs w:val="22"/>
+        </w:rPr>
+        <w:t xml:space="preserve"> </w:t>
+      </w:r>
+      <w:r>
+        <w:rPr>
+          <w:rFonts w:ascii="Times New Roman" w:eastAsia="Times New Roman" w:hAnsi="Times New Roman" w:cs="Times New Roman"/>
+          <w:i/>
+          <w:iCs/>
+          <w:sz w:val="22"/>
+          <w:szCs w:val="22"/>
+        </w:rPr>
+        <w:t>drone</w:t>
+      </w:r>
+      <w:r>
+        <w:rPr>
+          <w:rFonts w:ascii="Times New Roman" w:eastAsia="Times New Roman" w:hAnsi="Times New Roman" w:cs="Times New Roman"/>
+          <w:sz w:val="22"/>
+          <w:szCs w:val="22"/>
+        </w:rPr>
+        <w:t xml:space="preserve"> </w:t>
+      </w:r>
+      <w:proofErr w:type="spellStart"/>
+      <w:r>
+        <w:rPr>
+          <w:rFonts w:ascii="Times New Roman" w:eastAsia="Times New Roman" w:hAnsi="Times New Roman" w:cs="Times New Roman"/>
+          <w:sz w:val="22"/>
+          <w:szCs w:val="22"/>
+        </w:rPr>
+        <w:t>melalui</w:t>
+      </w:r>
+      <w:proofErr w:type="spellEnd"/>
+      <w:r>
+        <w:rPr>
+          <w:rFonts w:ascii="Times New Roman" w:eastAsia="Times New Roman" w:hAnsi="Times New Roman" w:cs="Times New Roman"/>
+          <w:sz w:val="22"/>
+          <w:szCs w:val="22"/>
+        </w:rPr>
+        <w:t xml:space="preserve"> </w:t>
+      </w:r>
+      <w:proofErr w:type="spellStart"/>
+      <w:r>
+        <w:rPr>
+          <w:rFonts w:ascii="Times New Roman" w:eastAsia="Times New Roman" w:hAnsi="Times New Roman" w:cs="Times New Roman"/>
+          <w:sz w:val="22"/>
+          <w:szCs w:val="22"/>
+        </w:rPr>
+        <w:t>perancangan</w:t>
+      </w:r>
+      <w:proofErr w:type="spellEnd"/>
+      <w:r>
+        <w:rPr>
+          <w:rFonts w:ascii="Times New Roman" w:eastAsia="Times New Roman" w:hAnsi="Times New Roman" w:cs="Times New Roman"/>
+          <w:sz w:val="22"/>
+          <w:szCs w:val="22"/>
+        </w:rPr>
+        <w:t xml:space="preserve"> </w:t>
+      </w:r>
+      <w:r>
+        <w:rPr>
+          <w:rFonts w:ascii="Times New Roman" w:eastAsia="Times New Roman" w:hAnsi="Times New Roman" w:cs="Times New Roman"/>
+          <w:i/>
+          <w:iCs/>
+          <w:sz w:val="22"/>
+          <w:szCs w:val="22"/>
+        </w:rPr>
+        <w:t>payload</w:t>
+      </w:r>
+      <w:r>
+        <w:rPr>
+          <w:rFonts w:ascii="Times New Roman" w:eastAsia="Times New Roman" w:hAnsi="Times New Roman" w:cs="Times New Roman"/>
+          <w:sz w:val="22"/>
+          <w:szCs w:val="22"/>
+        </w:rPr>
+        <w:t xml:space="preserve"> 3D (SketchUp, Cura), </w:t>
+      </w:r>
+      <w:proofErr w:type="spellStart"/>
+      <w:r>
+        <w:rPr>
+          <w:rFonts w:ascii="Times New Roman" w:eastAsia="Times New Roman" w:hAnsi="Times New Roman" w:cs="Times New Roman"/>
+          <w:sz w:val="22"/>
+          <w:szCs w:val="22"/>
+        </w:rPr>
+        <w:t>penyolderan</w:t>
+      </w:r>
+      <w:proofErr w:type="spellEnd"/>
+      <w:r>
+        <w:rPr>
+          <w:rFonts w:ascii="Times New Roman" w:eastAsia="Times New Roman" w:hAnsi="Times New Roman" w:cs="Times New Roman"/>
+          <w:sz w:val="22"/>
+          <w:szCs w:val="22"/>
+        </w:rPr>
+        <w:t xml:space="preserve"> </w:t>
+      </w:r>
+      <w:proofErr w:type="spellStart"/>
+      <w:r>
+        <w:rPr>
+          <w:rFonts w:ascii="Times New Roman" w:eastAsia="Times New Roman" w:hAnsi="Times New Roman" w:cs="Times New Roman"/>
+          <w:sz w:val="22"/>
+          <w:szCs w:val="22"/>
+        </w:rPr>
+        <w:t>komponen</w:t>
+      </w:r>
+      <w:proofErr w:type="spellEnd"/>
+      <w:r>
+        <w:rPr>
+          <w:rFonts w:ascii="Times New Roman" w:eastAsia="Times New Roman" w:hAnsi="Times New Roman" w:cs="Times New Roman"/>
+          <w:sz w:val="22"/>
+          <w:szCs w:val="22"/>
+        </w:rPr>
+        <w:t xml:space="preserve"> </w:t>
+      </w:r>
+      <w:proofErr w:type="spellStart"/>
+      <w:r>
+        <w:rPr>
+          <w:rFonts w:ascii="Times New Roman" w:eastAsia="Times New Roman" w:hAnsi="Times New Roman" w:cs="Times New Roman"/>
+          <w:sz w:val="22"/>
+          <w:szCs w:val="22"/>
+        </w:rPr>
+        <w:t>mikro</w:t>
+      </w:r>
+      <w:proofErr w:type="spellEnd"/>
+      <w:r>
+        <w:rPr>
+          <w:rFonts w:ascii="Times New Roman" w:eastAsia="Times New Roman" w:hAnsi="Times New Roman" w:cs="Times New Roman"/>
+          <w:sz w:val="22"/>
+          <w:szCs w:val="22"/>
+        </w:rPr>
+        <w:t xml:space="preserve">, </w:t>
+      </w:r>
+      <w:proofErr w:type="spellStart"/>
+      <w:r>
+        <w:rPr>
+          <w:rFonts w:ascii="Times New Roman" w:eastAsia="Times New Roman" w:hAnsi="Times New Roman" w:cs="Times New Roman"/>
+          <w:sz w:val="22"/>
+          <w:szCs w:val="22"/>
+        </w:rPr>
+        <w:t>serta</w:t>
+      </w:r>
+      <w:proofErr w:type="spellEnd"/>
+      <w:r>
+        <w:rPr>
+          <w:rFonts w:ascii="Times New Roman" w:eastAsia="Times New Roman" w:hAnsi="Times New Roman" w:cs="Times New Roman"/>
+          <w:sz w:val="22"/>
+          <w:szCs w:val="22"/>
+        </w:rPr>
+        <w:t xml:space="preserve"> </w:t>
+      </w:r>
+      <w:proofErr w:type="spellStart"/>
+      <w:r>
+        <w:rPr>
+          <w:rFonts w:ascii="Times New Roman" w:eastAsia="Times New Roman" w:hAnsi="Times New Roman" w:cs="Times New Roman"/>
+          <w:sz w:val="22"/>
+          <w:szCs w:val="22"/>
+        </w:rPr>
+        <w:t>pemrograman</w:t>
+      </w:r>
+      <w:proofErr w:type="spellEnd"/>
+      <w:r>
+        <w:rPr>
+          <w:rFonts w:ascii="Times New Roman" w:eastAsia="Times New Roman" w:hAnsi="Times New Roman" w:cs="Times New Roman"/>
+          <w:sz w:val="22"/>
+          <w:szCs w:val="22"/>
+        </w:rPr>
+        <w:t xml:space="preserve"> C/C++ pada </w:t>
+      </w:r>
+      <w:proofErr w:type="spellStart"/>
+      <w:r>
+        <w:rPr>
+          <w:rFonts w:ascii="Times New Roman" w:eastAsia="Times New Roman" w:hAnsi="Times New Roman" w:cs="Times New Roman"/>
+          <w:sz w:val="22"/>
+          <w:szCs w:val="22"/>
+        </w:rPr>
+        <w:t>modul</w:t>
+      </w:r>
+      <w:proofErr w:type="spellEnd"/>
+      <w:r>
+        <w:rPr>
+          <w:rFonts w:ascii="Times New Roman" w:eastAsia="Times New Roman" w:hAnsi="Times New Roman" w:cs="Times New Roman"/>
+          <w:sz w:val="22"/>
+          <w:szCs w:val="22"/>
+        </w:rPr>
+        <w:t xml:space="preserve"> ESP32-S3-CAM </w:t>
+      </w:r>
+      <w:proofErr w:type="spellStart"/>
+      <w:r>
+        <w:rPr>
+          <w:rFonts w:ascii="Times New Roman" w:eastAsia="Times New Roman" w:hAnsi="Times New Roman" w:cs="Times New Roman"/>
+          <w:sz w:val="22"/>
+          <w:szCs w:val="22"/>
         </w:rPr>
         <w:t>untuk</w:t>
       </w:r>
@@ -1550,10 +1969,8 @@
       <w:r>
         <w:rPr>
           <w:rFonts w:ascii="Times New Roman" w:eastAsia="Times New Roman" w:hAnsi="Times New Roman" w:cs="Times New Roman"/>
-          <w:b/>
-          <w:bCs/>
-          <w:sz w:val="21"/>
-          <w:szCs w:val="21"/>
+          <w:sz w:val="22"/>
+          <w:szCs w:val="22"/>
         </w:rPr>
         <w:t xml:space="preserve"> </w:t>
       </w:r>
@@ -1561,21 +1978,17 @@
       <w:r>
         <w:rPr>
           <w:rFonts w:ascii="Times New Roman" w:eastAsia="Times New Roman" w:hAnsi="Times New Roman" w:cs="Times New Roman"/>
-          <w:b/>
-          <w:bCs/>
-          <w:sz w:val="21"/>
-          <w:szCs w:val="21"/>
-        </w:rPr>
-        <w:t>Pengamanan</w:t>
-      </w:r>
-      <w:proofErr w:type="spellEnd"/>
-      <w:r>
-        <w:rPr>
-          <w:rFonts w:ascii="Times New Roman" w:eastAsia="Times New Roman" w:hAnsi="Times New Roman" w:cs="Times New Roman"/>
-          <w:b/>
-          <w:bCs/>
-          <w:sz w:val="21"/>
-          <w:szCs w:val="21"/>
+          <w:sz w:val="22"/>
+          <w:szCs w:val="22"/>
+        </w:rPr>
+        <w:t>optimasi</w:t>
+      </w:r>
+      <w:proofErr w:type="spellEnd"/>
+      <w:r>
+        <w:rPr>
+          <w:rFonts w:ascii="Times New Roman" w:eastAsia="Times New Roman" w:hAnsi="Times New Roman" w:cs="Times New Roman"/>
+          <w:sz w:val="22"/>
+          <w:szCs w:val="22"/>
         </w:rPr>
         <w:t xml:space="preserve"> </w:t>
       </w:r>
@@ -1583,119 +1996,37 @@
       <w:r>
         <w:rPr>
           <w:rFonts w:ascii="Times New Roman" w:eastAsia="Times New Roman" w:hAnsi="Times New Roman" w:cs="Times New Roman"/>
-          <w:b/>
-          <w:bCs/>
-          <w:sz w:val="21"/>
-          <w:szCs w:val="21"/>
-        </w:rPr>
-        <w:t>Ujian</w:t>
-      </w:r>
-      <w:proofErr w:type="spellEnd"/>
-      <w:r>
-        <w:rPr>
-          <w:rFonts w:ascii="Times New Roman" w:eastAsia="Times New Roman" w:hAnsi="Times New Roman" w:cs="Times New Roman"/>
-          <w:b/>
-          <w:bCs/>
-          <w:sz w:val="21"/>
-          <w:szCs w:val="21"/>
+          <w:sz w:val="22"/>
+          <w:szCs w:val="22"/>
+        </w:rPr>
+        <w:t>pemantauan</w:t>
+      </w:r>
+      <w:proofErr w:type="spellEnd"/>
+      <w:r>
+        <w:rPr>
+          <w:rFonts w:ascii="Times New Roman" w:eastAsia="Times New Roman" w:hAnsi="Times New Roman" w:cs="Times New Roman"/>
+          <w:sz w:val="22"/>
+          <w:szCs w:val="22"/>
+        </w:rPr>
+        <w:t xml:space="preserve"> </w:t>
+      </w:r>
+      <w:r>
+        <w:rPr>
+          <w:rFonts w:ascii="Times New Roman" w:eastAsia="Times New Roman" w:hAnsi="Times New Roman" w:cs="Times New Roman"/>
+          <w:i/>
+          <w:iCs/>
+          <w:sz w:val="22"/>
+          <w:szCs w:val="22"/>
+        </w:rPr>
+        <w:t>hardware</w:t>
+      </w:r>
+      <w:r>
+        <w:rPr>
+          <w:rFonts w:ascii="Times New Roman" w:eastAsia="Times New Roman" w:hAnsi="Times New Roman" w:cs="Times New Roman"/>
+          <w:sz w:val="22"/>
+          <w:szCs w:val="22"/>
         </w:rPr>
         <w:t>.</w:t>
-      </w:r>
-      <w:r>
-        <w:rPr>
-          <w:rFonts w:ascii="Times New Roman" w:eastAsia="Times New Roman" w:hAnsi="Times New Roman" w:cs="Times New Roman"/>
-          <w:b/>
-          <w:bCs/>
-          <w:sz w:val="22"/>
-          <w:szCs w:val="22"/>
-        </w:rPr>
-        <w:t xml:space="preserve"> – </w:t>
-      </w:r>
-      <w:r>
-        <w:rPr>
-          <w:rFonts w:ascii="Times New Roman" w:eastAsia="Times New Roman" w:hAnsi="Times New Roman" w:cs="Times New Roman"/>
-          <w:b/>
-          <w:bCs/>
-          <w:sz w:val="21"/>
-          <w:szCs w:val="21"/>
-        </w:rPr>
-        <w:t>Bekasi, Indonesia</w:t>
-      </w:r>
-    </w:p>
-    <w:p>
-      <w:pPr>
-        <w:tabs>
-          <w:tab w:val="left" w:pos="1134"/>
-          <w:tab w:val="right" w:pos="10503"/>
-        </w:tabs>
-        <w:rPr>
-          <w:rFonts w:ascii="Times New Roman" w:eastAsia="Times New Roman" w:hAnsi="Times New Roman" w:cs="Times New Roman"/>
-          <w:b/>
-          <w:bCs/>
-          <w:i/>
-          <w:iCs/>
-          <w:sz w:val="21"/>
-          <w:szCs w:val="21"/>
-        </w:rPr>
-      </w:pPr>
-      <w:r>
-        <w:rPr>
-          <w:rFonts w:ascii="Times New Roman" w:eastAsia="Times New Roman" w:hAnsi="Times New Roman" w:cs="Times New Roman"/>
-          <w:i/>
-          <w:iCs/>
-          <w:sz w:val="21"/>
-          <w:szCs w:val="21"/>
-        </w:rPr>
-        <w:t>Project Developer</w:t>
-      </w:r>
-      <w:r>
-        <w:rPr>
-          <w:rFonts w:ascii="Times New Roman" w:eastAsia="Times New Roman" w:hAnsi="Times New Roman" w:cs="Times New Roman"/>
-          <w:i/>
-          <w:iCs/>
-          <w:sz w:val="21"/>
-          <w:szCs w:val="21"/>
-        </w:rPr>
-        <w:tab/>
-      </w:r>
-      <w:r>
-        <w:rPr>
-          <w:rFonts w:ascii="Times New Roman" w:eastAsia="Times New Roman" w:hAnsi="Times New Roman" w:cs="Times New Roman"/>
-          <w:b/>
-          <w:bCs/>
-          <w:i/>
-          <w:iCs/>
-          <w:sz w:val="21"/>
-          <w:szCs w:val="21"/>
-        </w:rPr>
-        <w:t>September 2022 – Present</w:t>
-      </w:r>
-    </w:p>
-    <w:p>
-      <w:pPr>
-        <w:numPr>
-          <w:ilvl w:val="0"/>
-          <w:numId w:val="2"/>
-        </w:numPr>
-        <w:tabs>
-          <w:tab w:val="left" w:pos="284"/>
-          <w:tab w:val="left" w:pos="630"/>
-        </w:tabs>
-        <w:rPr>
-          <w:rFonts w:ascii="Times New Roman" w:eastAsia="Times New Roman" w:hAnsi="Times New Roman" w:cs="Times New Roman"/>
-          <w:sz w:val="21"/>
-          <w:szCs w:val="21"/>
-          <w:lang w:val="sv-SE"/>
-        </w:rPr>
-      </w:pPr>
-      <w:r>
-        <w:rPr>
-          <w:rFonts w:ascii="Times New Roman" w:eastAsia="Times New Roman" w:hAnsi="Times New Roman" w:cs="Times New Roman"/>
-          <w:sz w:val="21"/>
-          <w:szCs w:val="21"/>
-          <w:lang w:val="sv-SE"/>
-        </w:rPr>
-        <w:t>Mengembangkan alat simulasi jammer berbasis ESP8266 untuk mengganggu sinyal seluler selama ujian.</w:t>
       </w:r>
     </w:p>
     <w:p>
@@ -1710,17 +2041,15 @@
           <w:rFonts w:ascii="Times New Roman" w:eastAsia="Times New Roman" w:hAnsi="Times New Roman" w:cs="Times New Roman"/>
           <w:sz w:val="21"/>
           <w:szCs w:val="21"/>
-          <w:lang w:val="sv-SE"/>
-        </w:rPr>
-      </w:pPr>
-      <w:r>
-        <w:rPr>
-          <w:rFonts w:ascii="Times New Roman" w:eastAsia="Times New Roman" w:hAnsi="Times New Roman" w:cs="Times New Roman"/>
-          <w:b/>
-          <w:bCs/>
-          <w:sz w:val="22"/>
-          <w:szCs w:val="22"/>
-          <w:lang w:val="sv-SE"/>
+        </w:rPr>
+      </w:pPr>
+      <w:r>
+        <w:rPr>
+          <w:rFonts w:ascii="Times New Roman" w:eastAsia="Times New Roman" w:hAnsi="Times New Roman" w:cs="Times New Roman"/>
+          <w:b/>
+          <w:bCs/>
+          <w:sz w:val="22"/>
+          <w:szCs w:val="22"/>
         </w:rPr>
         <w:t>ORGANIZATIONAL EXPERIENCE</w:t>
       </w:r>
@@ -1729,7 +2058,6 @@
           <w:rFonts w:ascii="Times New Roman" w:eastAsia="Times New Roman" w:hAnsi="Times New Roman" w:cs="Times New Roman"/>
           <w:sz w:val="21"/>
           <w:szCs w:val="21"/>
-          <w:lang w:val="sv-SE"/>
         </w:rPr>
         <w:tab/>
       </w:r>
@@ -1744,7 +2072,6 @@
           <w:color w:val="404040"/>
           <w:sz w:val="4"/>
           <w:szCs w:val="4"/>
-          <w:lang w:val="sv-SE"/>
         </w:rPr>
       </w:pPr>
     </w:p>
@@ -1758,7 +2085,6 @@
           <w:color w:val="404040"/>
           <w:sz w:val="6"/>
           <w:szCs w:val="6"/>
-          <w:lang w:val="sv-SE"/>
         </w:rPr>
       </w:pPr>
     </w:p>
@@ -1775,17 +2101,15 @@
           <w:iCs/>
           <w:sz w:val="21"/>
           <w:szCs w:val="21"/>
-          <w:lang w:val="sv-SE"/>
-        </w:rPr>
-      </w:pPr>
-      <w:r>
-        <w:rPr>
-          <w:rFonts w:ascii="Times New Roman" w:eastAsia="Times New Roman" w:hAnsi="Times New Roman" w:cs="Times New Roman"/>
-          <w:b/>
-          <w:bCs/>
-          <w:sz w:val="21"/>
-          <w:szCs w:val="21"/>
-          <w:lang w:val="sv-SE"/>
+        </w:rPr>
+      </w:pPr>
+      <w:r>
+        <w:rPr>
+          <w:rFonts w:ascii="Times New Roman" w:eastAsia="Times New Roman" w:hAnsi="Times New Roman" w:cs="Times New Roman"/>
+          <w:b/>
+          <w:bCs/>
+          <w:sz w:val="21"/>
+          <w:szCs w:val="21"/>
         </w:rPr>
         <w:t xml:space="preserve">Staff Divisi Dana Konsumsi </w:t>
       </w:r>
@@ -1794,18 +2118,34 @@
           <w:rFonts w:ascii="Times New Roman" w:eastAsia="Times New Roman" w:hAnsi="Times New Roman" w:cs="Times New Roman"/>
           <w:sz w:val="21"/>
           <w:szCs w:val="21"/>
-          <w:lang w:val="sv-SE"/>
-        </w:rPr>
-        <w:t>- Olahraga Elektro 2023</w:t>
-      </w:r>
-      <w:r>
-        <w:rPr>
-          <w:rFonts w:ascii="Times New Roman" w:eastAsia="Times New Roman" w:hAnsi="Times New Roman" w:cs="Times New Roman"/>
-          <w:i/>
-          <w:iCs/>
-          <w:sz w:val="21"/>
-          <w:szCs w:val="21"/>
-          <w:lang w:val="sv-SE"/>
+        </w:rPr>
+        <w:t xml:space="preserve">- </w:t>
+      </w:r>
+      <w:proofErr w:type="spellStart"/>
+      <w:r>
+        <w:rPr>
+          <w:rFonts w:ascii="Times New Roman" w:eastAsia="Times New Roman" w:hAnsi="Times New Roman" w:cs="Times New Roman"/>
+          <w:sz w:val="21"/>
+          <w:szCs w:val="21"/>
+        </w:rPr>
+        <w:t>Olahraga</w:t>
+      </w:r>
+      <w:proofErr w:type="spellEnd"/>
+      <w:r>
+        <w:rPr>
+          <w:rFonts w:ascii="Times New Roman" w:eastAsia="Times New Roman" w:hAnsi="Times New Roman" w:cs="Times New Roman"/>
+          <w:sz w:val="21"/>
+          <w:szCs w:val="21"/>
+        </w:rPr>
+        <w:t xml:space="preserve"> Elektro 2023</w:t>
+      </w:r>
+      <w:r>
+        <w:rPr>
+          <w:rFonts w:ascii="Times New Roman" w:eastAsia="Times New Roman" w:hAnsi="Times New Roman" w:cs="Times New Roman"/>
+          <w:i/>
+          <w:iCs/>
+          <w:sz w:val="21"/>
+          <w:szCs w:val="21"/>
         </w:rPr>
         <w:tab/>
       </w:r>
@@ -1816,7 +2156,6 @@
           <w:iCs/>
           <w:sz w:val="21"/>
           <w:szCs w:val="21"/>
-          <w:lang w:val="sv-SE"/>
         </w:rPr>
         <w:tab/>
       </w:r>
@@ -1827,7 +2166,6 @@
           <w:iCs/>
           <w:sz w:val="21"/>
           <w:szCs w:val="21"/>
-          <w:lang w:val="sv-SE"/>
         </w:rPr>
         <w:tab/>
       </w:r>
@@ -1838,7 +2176,6 @@
           <w:iCs/>
           <w:sz w:val="21"/>
           <w:szCs w:val="21"/>
-          <w:lang w:val="sv-SE"/>
         </w:rPr>
         <w:tab/>
       </w:r>
@@ -1849,7 +2186,6 @@
           <w:iCs/>
           <w:sz w:val="21"/>
           <w:szCs w:val="21"/>
-          <w:lang w:val="sv-SE"/>
         </w:rPr>
         <w:tab/>
         <w:t xml:space="preserve">         </w:t>
@@ -1861,7 +2197,6 @@
           <w:iCs/>
           <w:sz w:val="21"/>
           <w:szCs w:val="21"/>
-          <w:lang w:val="sv-SE"/>
         </w:rPr>
         <w:t xml:space="preserve">   </w:t>
       </w:r>
@@ -1874,7 +2209,6 @@
           <w:iCs/>
           <w:sz w:val="21"/>
           <w:szCs w:val="21"/>
-          <w:lang w:val="sv-SE"/>
         </w:rPr>
         <w:t>April 2024– Juli 2024</w:t>
       </w:r>
@@ -1892,17 +2226,15 @@
           <w:iCs/>
           <w:sz w:val="21"/>
           <w:szCs w:val="21"/>
-          <w:lang w:val="en-ID"/>
-        </w:rPr>
-      </w:pPr>
-      <w:r>
-        <w:rPr>
-          <w:rFonts w:ascii="Times New Roman" w:eastAsia="Times New Roman" w:hAnsi="Times New Roman" w:cs="Times New Roman"/>
-          <w:b/>
-          <w:bCs/>
-          <w:sz w:val="21"/>
-          <w:szCs w:val="21"/>
-          <w:lang w:val="en-ID"/>
+        </w:rPr>
+      </w:pPr>
+      <w:r>
+        <w:rPr>
+          <w:rFonts w:ascii="Times New Roman" w:eastAsia="Times New Roman" w:hAnsi="Times New Roman" w:cs="Times New Roman"/>
+          <w:b/>
+          <w:bCs/>
+          <w:sz w:val="21"/>
+          <w:szCs w:val="21"/>
         </w:rPr>
         <w:t xml:space="preserve">Wakil </w:t>
       </w:r>
@@ -1914,7 +2246,6 @@
           <w:bCs/>
           <w:sz w:val="21"/>
           <w:szCs w:val="21"/>
-          <w:lang w:val="en-ID"/>
         </w:rPr>
         <w:t>Ketua</w:t>
       </w:r>
@@ -1924,25 +2255,32 @@
           <w:rFonts w:ascii="Times New Roman" w:eastAsia="Times New Roman" w:hAnsi="Times New Roman" w:cs="Times New Roman"/>
           <w:sz w:val="21"/>
           <w:szCs w:val="21"/>
-          <w:lang w:val="en-ID"/>
-        </w:rPr>
-        <w:t xml:space="preserve"> - Computer Student Club PNJ  </w:t>
-      </w:r>
-      <w:r>
-        <w:rPr>
-          <w:rFonts w:ascii="Times New Roman" w:eastAsia="Times New Roman" w:hAnsi="Times New Roman" w:cs="Times New Roman"/>
-          <w:sz w:val="21"/>
-          <w:szCs w:val="21"/>
-          <w:lang w:val="en-ID"/>
+        </w:rPr>
+        <w:t xml:space="preserve"> - Computer Student Club </w:t>
+      </w:r>
+      <w:proofErr w:type="gramStart"/>
+      <w:r>
+        <w:rPr>
+          <w:rFonts w:ascii="Times New Roman" w:eastAsia="Times New Roman" w:hAnsi="Times New Roman" w:cs="Times New Roman"/>
+          <w:sz w:val="21"/>
+          <w:szCs w:val="21"/>
+        </w:rPr>
+        <w:t xml:space="preserve">PNJ  </w:t>
+      </w:r>
+      <w:r>
+        <w:rPr>
+          <w:rFonts w:ascii="Times New Roman" w:eastAsia="Times New Roman" w:hAnsi="Times New Roman" w:cs="Times New Roman"/>
+          <w:sz w:val="21"/>
+          <w:szCs w:val="21"/>
         </w:rPr>
         <w:tab/>
       </w:r>
-      <w:r>
-        <w:rPr>
-          <w:rFonts w:ascii="Times New Roman" w:eastAsia="Times New Roman" w:hAnsi="Times New Roman" w:cs="Times New Roman"/>
-          <w:sz w:val="21"/>
-          <w:szCs w:val="21"/>
-          <w:lang w:val="en-ID"/>
+      <w:proofErr w:type="gramEnd"/>
+      <w:r>
+        <w:rPr>
+          <w:rFonts w:ascii="Times New Roman" w:eastAsia="Times New Roman" w:hAnsi="Times New Roman" w:cs="Times New Roman"/>
+          <w:sz w:val="21"/>
+          <w:szCs w:val="21"/>
         </w:rPr>
         <w:tab/>
       </w:r>
@@ -1951,7 +2289,6 @@
           <w:rFonts w:ascii="Times New Roman" w:eastAsia="Times New Roman" w:hAnsi="Times New Roman" w:cs="Times New Roman"/>
           <w:sz w:val="21"/>
           <w:szCs w:val="21"/>
-          <w:lang w:val="en-ID"/>
         </w:rPr>
         <w:tab/>
       </w:r>
@@ -1960,7 +2297,6 @@
           <w:rFonts w:ascii="Times New Roman" w:eastAsia="Times New Roman" w:hAnsi="Times New Roman" w:cs="Times New Roman"/>
           <w:sz w:val="21"/>
           <w:szCs w:val="21"/>
-          <w:lang w:val="en-ID"/>
         </w:rPr>
         <w:tab/>
         <w:t xml:space="preserve">          </w:t>
@@ -1970,7 +2306,6 @@
           <w:rFonts w:ascii="Times New Roman" w:eastAsia="Times New Roman" w:hAnsi="Times New Roman" w:cs="Times New Roman"/>
           <w:sz w:val="21"/>
           <w:szCs w:val="21"/>
-          <w:lang w:val="en-ID"/>
         </w:rPr>
         <w:tab/>
         <w:t xml:space="preserve">                    </w:t>
@@ -1984,7 +2319,6 @@
           <w:iCs/>
           <w:sz w:val="21"/>
           <w:szCs w:val="21"/>
-          <w:lang w:val="en-ID"/>
         </w:rPr>
         <w:t xml:space="preserve">Maret 2025 – </w:t>
       </w:r>
@@ -1997,35 +2331,8 @@
           <w:iCs/>
           <w:sz w:val="21"/>
           <w:szCs w:val="21"/>
-          <w:lang w:val="en-ID"/>
-        </w:rPr>
-        <w:t xml:space="preserve">Maret </w:t>
-      </w:r>
-      <w:r>
-        <w:rPr>
-          <w:rFonts w:ascii="Times New Roman" w:eastAsia="Times New Roman" w:hAnsi="Times New Roman" w:cs="Times New Roman"/>
-          <w:b/>
-          <w:bCs/>
-          <w:i/>
-          <w:iCs/>
-          <w:sz w:val="21"/>
-          <w:szCs w:val="21"/>
-          <w:lang w:val="en-ID"/>
-        </w:rPr>
-        <w:t>2</w:t>
-      </w:r>
-      <w:r>
-        <w:rPr>
-          <w:rFonts w:ascii="Times New Roman" w:eastAsia="Times New Roman" w:hAnsi="Times New Roman" w:cs="Times New Roman"/>
-          <w:b/>
-          <w:bCs/>
-          <w:i/>
-          <w:iCs/>
-          <w:sz w:val="21"/>
-          <w:szCs w:val="21"/>
-          <w:lang w:val="en-ID"/>
-        </w:rPr>
-        <w:t>026</w:t>
+        </w:rPr>
+        <w:t>Maret 2026</w:t>
       </w:r>
     </w:p>
     <w:p>
@@ -2041,45 +2348,80 @@
           <w:iCs/>
           <w:sz w:val="21"/>
           <w:szCs w:val="21"/>
-          <w:lang w:val="sv-SE"/>
-        </w:rPr>
-      </w:pPr>
-      <w:r>
-        <w:rPr>
-          <w:rFonts w:ascii="Times New Roman" w:eastAsia="Times New Roman" w:hAnsi="Times New Roman" w:cs="Times New Roman"/>
-          <w:b/>
-          <w:bCs/>
-          <w:sz w:val="21"/>
-          <w:szCs w:val="21"/>
-          <w:lang w:val="sv-SE"/>
-        </w:rPr>
-        <w:t>Kepala Divisi IoT</w:t>
-      </w:r>
-      <w:r>
-        <w:rPr>
-          <w:rFonts w:ascii="Times New Roman" w:eastAsia="Times New Roman" w:hAnsi="Times New Roman" w:cs="Times New Roman"/>
-          <w:sz w:val="21"/>
-          <w:szCs w:val="21"/>
-          <w:lang w:val="sv-SE"/>
-        </w:rPr>
-        <w:t xml:space="preserve"> -Telextion PNJ  </w:t>
-      </w:r>
-      <w:r>
-        <w:rPr>
-          <w:rFonts w:ascii="Times New Roman" w:eastAsia="Times New Roman" w:hAnsi="Times New Roman" w:cs="Times New Roman"/>
-          <w:sz w:val="21"/>
-          <w:szCs w:val="21"/>
-          <w:lang w:val="sv-SE"/>
+        </w:rPr>
+      </w:pPr>
+      <w:proofErr w:type="spellStart"/>
+      <w:r>
+        <w:rPr>
+          <w:rFonts w:ascii="Times New Roman" w:eastAsia="Times New Roman" w:hAnsi="Times New Roman" w:cs="Times New Roman"/>
+          <w:b/>
+          <w:bCs/>
+          <w:sz w:val="21"/>
+          <w:szCs w:val="21"/>
+        </w:rPr>
+        <w:t>Kepala</w:t>
+      </w:r>
+      <w:proofErr w:type="spellEnd"/>
+      <w:r>
+        <w:rPr>
+          <w:rFonts w:ascii="Times New Roman" w:eastAsia="Times New Roman" w:hAnsi="Times New Roman" w:cs="Times New Roman"/>
+          <w:b/>
+          <w:bCs/>
+          <w:sz w:val="21"/>
+          <w:szCs w:val="21"/>
+        </w:rPr>
+        <w:t xml:space="preserve"> Divisi IoT</w:t>
+      </w:r>
+      <w:r>
+        <w:rPr>
+          <w:rFonts w:ascii="Times New Roman" w:eastAsia="Times New Roman" w:hAnsi="Times New Roman" w:cs="Times New Roman"/>
+          <w:sz w:val="21"/>
+          <w:szCs w:val="21"/>
+        </w:rPr>
+        <w:t xml:space="preserve"> -</w:t>
+      </w:r>
+      <w:proofErr w:type="spellStart"/>
+      <w:r>
+        <w:rPr>
+          <w:rFonts w:ascii="Times New Roman" w:eastAsia="Times New Roman" w:hAnsi="Times New Roman" w:cs="Times New Roman"/>
+          <w:sz w:val="21"/>
+          <w:szCs w:val="21"/>
+        </w:rPr>
+        <w:t>Telextion</w:t>
+      </w:r>
+      <w:proofErr w:type="spellEnd"/>
+      <w:r>
+        <w:rPr>
+          <w:rFonts w:ascii="Times New Roman" w:eastAsia="Times New Roman" w:hAnsi="Times New Roman" w:cs="Times New Roman"/>
+          <w:sz w:val="21"/>
+          <w:szCs w:val="21"/>
+        </w:rPr>
+        <w:t xml:space="preserve"> </w:t>
+      </w:r>
+      <w:proofErr w:type="gramStart"/>
+      <w:r>
+        <w:rPr>
+          <w:rFonts w:ascii="Times New Roman" w:eastAsia="Times New Roman" w:hAnsi="Times New Roman" w:cs="Times New Roman"/>
+          <w:sz w:val="21"/>
+          <w:szCs w:val="21"/>
+        </w:rPr>
+        <w:t xml:space="preserve">PNJ  </w:t>
+      </w:r>
+      <w:r>
+        <w:rPr>
+          <w:rFonts w:ascii="Times New Roman" w:eastAsia="Times New Roman" w:hAnsi="Times New Roman" w:cs="Times New Roman"/>
+          <w:sz w:val="21"/>
+          <w:szCs w:val="21"/>
         </w:rPr>
         <w:tab/>
       </w:r>
+      <w:proofErr w:type="gramEnd"/>
       <w:r>
         <w:rPr>
           <w:rFonts w:ascii="Times New Roman" w:eastAsia="Times New Roman" w:hAnsi="Times New Roman" w:cs="Times New Roman"/>
           <w:color w:val="404040"/>
           <w:sz w:val="21"/>
           <w:szCs w:val="21"/>
-          <w:lang w:val="sv-SE"/>
         </w:rPr>
         <w:tab/>
       </w:r>
@@ -2091,7 +2433,6 @@
           <w:color w:val="404040"/>
           <w:sz w:val="21"/>
           <w:szCs w:val="21"/>
-          <w:lang w:val="sv-SE"/>
         </w:rPr>
         <w:tab/>
       </w:r>
@@ -2103,7 +2444,6 @@
           <w:color w:val="404040"/>
           <w:sz w:val="21"/>
           <w:szCs w:val="21"/>
-          <w:lang w:val="sv-SE"/>
         </w:rPr>
         <w:tab/>
         <w:t xml:space="preserve">          </w:t>
@@ -2113,49 +2453,59 @@
           <w:rFonts w:ascii="Times New Roman" w:eastAsia="Times New Roman" w:hAnsi="Times New Roman" w:cs="Times New Roman"/>
           <w:sz w:val="21"/>
           <w:szCs w:val="21"/>
-          <w:lang w:val="sv-SE"/>
         </w:rPr>
         <w:tab/>
-        <w:t xml:space="preserve">                              </w:t>
-      </w:r>
-      <w:r>
-        <w:rPr>
-          <w:rFonts w:ascii="Times New Roman" w:eastAsia="Times New Roman" w:hAnsi="Times New Roman" w:cs="Times New Roman"/>
-          <w:b/>
-          <w:bCs/>
-          <w:i/>
-          <w:iCs/>
-          <w:sz w:val="21"/>
-          <w:szCs w:val="21"/>
-          <w:lang w:val="sv-SE"/>
+        <w:t xml:space="preserve">                             </w:t>
+      </w:r>
+      <w:r>
+        <w:rPr>
+          <w:rFonts w:ascii="Times New Roman" w:eastAsia="Times New Roman" w:hAnsi="Times New Roman" w:cs="Times New Roman"/>
+          <w:b/>
+          <w:bCs/>
+          <w:i/>
+          <w:iCs/>
+          <w:sz w:val="21"/>
+          <w:szCs w:val="21"/>
         </w:rPr>
         <w:t xml:space="preserve">Maret 2025 – </w:t>
       </w:r>
-      <w:r>
-        <w:rPr>
-          <w:rFonts w:ascii="Times New Roman" w:eastAsia="Times New Roman" w:hAnsi="Times New Roman" w:cs="Times New Roman"/>
-          <w:b/>
-          <w:bCs/>
-          <w:i/>
-          <w:iCs/>
-          <w:sz w:val="21"/>
-          <w:szCs w:val="21"/>
-          <w:lang w:val="sv-SE"/>
-        </w:rPr>
-        <w:t>Febuari</w:t>
-      </w:r>
-      <w:r>
-        <w:rPr>
-          <w:rFonts w:ascii="Times New Roman" w:eastAsia="Times New Roman" w:hAnsi="Times New Roman" w:cs="Times New Roman"/>
-          <w:b/>
-          <w:bCs/>
-          <w:i/>
-          <w:iCs/>
-          <w:sz w:val="21"/>
-          <w:szCs w:val="21"/>
-          <w:lang w:val="sv-SE"/>
-        </w:rPr>
-        <w:t xml:space="preserve"> 2026</w:t>
+      <w:proofErr w:type="spellStart"/>
+      <w:r>
+        <w:rPr>
+          <w:rFonts w:ascii="Times New Roman" w:eastAsia="Times New Roman" w:hAnsi="Times New Roman" w:cs="Times New Roman"/>
+          <w:b/>
+          <w:bCs/>
+          <w:i/>
+          <w:iCs/>
+          <w:sz w:val="21"/>
+          <w:szCs w:val="21"/>
+        </w:rPr>
+        <w:t>Februari</w:t>
+      </w:r>
+      <w:proofErr w:type="spellEnd"/>
+      <w:r>
+        <w:rPr>
+          <w:rFonts w:ascii="Times New Roman" w:eastAsia="Times New Roman" w:hAnsi="Times New Roman" w:cs="Times New Roman"/>
+          <w:b/>
+          <w:bCs/>
+          <w:i/>
+          <w:iCs/>
+          <w:sz w:val="21"/>
+          <w:szCs w:val="21"/>
+        </w:rPr>
+        <w:t xml:space="preserve"> </w:t>
+      </w:r>
+      <w:r>
+        <w:rPr>
+          <w:rFonts w:ascii="Times New Roman" w:eastAsia="Times New Roman" w:hAnsi="Times New Roman" w:cs="Times New Roman"/>
+          <w:b/>
+          <w:bCs/>
+          <w:i/>
+          <w:iCs/>
+          <w:sz w:val="21"/>
+          <w:szCs w:val="21"/>
+        </w:rPr>
+        <w:t>2026</w:t>
       </w:r>
     </w:p>
     <w:p>
@@ -2282,20 +2632,7 @@
           <w:szCs w:val="21"/>
           <w:lang w:val="en-ID"/>
         </w:rPr>
-        <w:t>Januari</w:t>
-      </w:r>
-      <w:r>
-        <w:rPr>
-          <w:rFonts w:ascii="Times New Roman" w:eastAsia="Times New Roman" w:hAnsi="Times New Roman" w:cs="Times New Roman"/>
-          <w:b/>
-          <w:bCs/>
-          <w:i/>
-          <w:iCs/>
-          <w:sz w:val="21"/>
-          <w:szCs w:val="21"/>
-          <w:lang w:val="en-ID"/>
-        </w:rPr>
-        <w:t xml:space="preserve"> </w:t>
+        <w:t xml:space="preserve">Januari </w:t>
       </w:r>
       <w:r>
         <w:rPr>
@@ -2396,15 +2733,17 @@
           <w:bCs/>
           <w:sz w:val="22"/>
           <w:szCs w:val="22"/>
-        </w:rPr>
-      </w:pPr>
-      <w:r>
-        <w:rPr>
-          <w:rFonts w:ascii="Times New Roman" w:eastAsia="Times New Roman" w:hAnsi="Times New Roman" w:cs="Times New Roman"/>
-          <w:b/>
-          <w:bCs/>
-          <w:sz w:val="21"/>
-          <w:szCs w:val="21"/>
+          <w:lang w:val="sv-SE"/>
+        </w:rPr>
+      </w:pPr>
+      <w:r>
+        <w:rPr>
+          <w:rFonts w:ascii="Times New Roman" w:eastAsia="Times New Roman" w:hAnsi="Times New Roman" w:cs="Times New Roman"/>
+          <w:b/>
+          <w:bCs/>
+          <w:sz w:val="21"/>
+          <w:szCs w:val="21"/>
+          <w:lang w:val="sv-SE"/>
         </w:rPr>
         <w:t xml:space="preserve">SMK Taman Harapan </w:t>
       </w:r>
@@ -2415,6 +2754,7 @@
           <w:bCs/>
           <w:sz w:val="22"/>
           <w:szCs w:val="22"/>
+          <w:lang w:val="sv-SE"/>
         </w:rPr>
         <w:t xml:space="preserve">– </w:t>
       </w:r>
@@ -2425,6 +2765,7 @@
           <w:bCs/>
           <w:sz w:val="21"/>
           <w:szCs w:val="21"/>
+          <w:lang w:val="sv-SE"/>
         </w:rPr>
         <w:t xml:space="preserve">Bekasi, Indonesia </w:t>
       </w:r>
@@ -2435,6 +2776,7 @@
           <w:iCs/>
           <w:sz w:val="21"/>
           <w:szCs w:val="21"/>
+          <w:lang w:val="sv-SE"/>
         </w:rPr>
         <w:tab/>
       </w:r>
@@ -2447,8 +2789,48 @@
           <w:iCs/>
           <w:sz w:val="21"/>
           <w:szCs w:val="21"/>
-        </w:rPr>
-        <w:t>June 2020 - June 2023</w:t>
+          <w:lang w:val="sv-SE"/>
+        </w:rPr>
+        <w:t xml:space="preserve">Juni </w:t>
+      </w:r>
+      <w:r>
+        <w:rPr>
+          <w:rFonts w:ascii="Times New Roman" w:eastAsia="Times New Roman" w:hAnsi="Times New Roman" w:cs="Times New Roman"/>
+          <w:b/>
+          <w:bCs/>
+          <w:i/>
+          <w:iCs/>
+          <w:sz w:val="21"/>
+          <w:szCs w:val="21"/>
+          <w:lang w:val="sv-SE"/>
+        </w:rPr>
+        <w:t xml:space="preserve">2020 - </w:t>
+      </w:r>
+      <w:r>
+        <w:rPr>
+          <w:rFonts w:ascii="Times New Roman" w:eastAsia="Times New Roman" w:hAnsi="Times New Roman" w:cs="Times New Roman"/>
+          <w:b/>
+          <w:bCs/>
+          <w:i/>
+          <w:iCs/>
+          <w:sz w:val="21"/>
+          <w:szCs w:val="21"/>
+          <w:lang w:val="sv-SE"/>
+        </w:rPr>
+        <w:t xml:space="preserve">Juni </w:t>
+      </w:r>
+      <w:r>
+        <w:rPr>
+          <w:rFonts w:ascii="Times New Roman" w:eastAsia="Times New Roman" w:hAnsi="Times New Roman" w:cs="Times New Roman"/>
+          <w:b/>
+          <w:bCs/>
+          <w:i/>
+          <w:iCs/>
+          <w:sz w:val="21"/>
+          <w:szCs w:val="21"/>
+          <w:lang w:val="sv-SE"/>
+        </w:rPr>
+        <w:t>2023</w:t>
       </w:r>
     </w:p>
     <w:p>
@@ -3000,7 +3382,7 @@
         </w:rPr>
         <w:t xml:space="preserve">Link Certifications &amp; Training: </w:t>
       </w:r>
-      <w:hyperlink r:id="rId5">
+      <w:hyperlink r:id="rId6">
         <w:r>
           <w:rPr>
             <w:rFonts w:ascii="Times New Roman" w:eastAsia="Times New Roman" w:hAnsi="Times New Roman" w:cs="Times New Roman"/>
@@ -3032,7 +3414,7 @@
         </w:rPr>
         <w:t xml:space="preserve">, </w:t>
       </w:r>
-      <w:hyperlink r:id="rId6">
+      <w:hyperlink r:id="rId7">
         <w:proofErr w:type="spellStart"/>
         <w:r>
           <w:rPr>
@@ -3076,7 +3458,7 @@
         </w:rPr>
         <w:t xml:space="preserve">, </w:t>
       </w:r>
-      <w:hyperlink r:id="rId7">
+      <w:hyperlink r:id="rId8">
         <w:proofErr w:type="spellStart"/>
         <w:r>
           <w:rPr>
@@ -3142,7 +3524,7 @@
         </w:rPr>
         <w:t xml:space="preserve">, </w:t>
       </w:r>
-      <w:hyperlink r:id="rId8">
+      <w:hyperlink r:id="rId9">
         <w:r>
           <w:rPr>
             <w:rFonts w:ascii="Times New Roman" w:eastAsia="Times New Roman" w:hAnsi="Times New Roman" w:cs="Times New Roman"/>
@@ -3196,7 +3578,7 @@
         </w:rPr>
         <w:t xml:space="preserve">, </w:t>
       </w:r>
-      <w:hyperlink r:id="rId9">
+      <w:hyperlink r:id="rId10">
         <w:r>
           <w:rPr>
             <w:rFonts w:ascii="Times New Roman" w:eastAsia="Times New Roman" w:hAnsi="Times New Roman" w:cs="Times New Roman"/>
@@ -3216,7 +3598,7 @@
         </w:rPr>
         <w:t xml:space="preserve">, </w:t>
       </w:r>
-      <w:hyperlink r:id="rId10">
+      <w:hyperlink r:id="rId11">
         <w:r>
           <w:rPr>
             <w:rFonts w:ascii="Times New Roman" w:eastAsia="Times New Roman" w:hAnsi="Times New Roman" w:cs="Times New Roman"/>
@@ -3280,7 +3662,7 @@
         </w:rPr>
         <w:t xml:space="preserve">, </w:t>
       </w:r>
-      <w:hyperlink r:id="rId11">
+      <w:hyperlink r:id="rId12">
         <w:r>
           <w:rPr>
             <w:rFonts w:ascii="Times New Roman" w:eastAsia="Times New Roman" w:hAnsi="Times New Roman" w:cs="Times New Roman"/>
@@ -3323,21 +3705,6 @@
         <w:t xml:space="preserve">. </w:t>
       </w:r>
     </w:p>
-    <w:p>
-      <w:pPr>
-        <w:tabs>
-          <w:tab w:val="left" w:pos="630"/>
-          <w:tab w:val="left" w:pos="900"/>
-        </w:tabs>
-        <w:rPr>
-          <w:rFonts w:ascii="Times New Roman" w:eastAsia="Times New Roman" w:hAnsi="Times New Roman" w:cs="Times New Roman"/>
-          <w:b/>
-          <w:bCs/>
-          <w:sz w:val="21"/>
-          <w:szCs w:val="21"/>
-        </w:rPr>
-      </w:pPr>
-    </w:p>
     <w:sectPr>
       <w:pgSz w:w="12240" w:h="15840"/>
       <w:pgMar w:top="765" w:right="879" w:bottom="805" w:left="879" w:header="720" w:footer="720" w:gutter="0"/>
@@ -3349,7 +3716,7 @@
 </file>
 
 <file path=word/numbering.xml><?xml version="1.0" encoding="utf-8"?>
-<w:numbering xmlns:wpc="http://schemas.microsoft.com/office/word/2010/wordprocessingCanvas" xmlns:cx="http://schemas.microsoft.com/office/drawing/2014/chartex" xmlns:cx1="http://schemas.microsoft.com/office/drawing/2015/9/8/chartex" xmlns:cx2="http://schemas.microsoft.com/office/drawing/2015/10/21/chartex" xmlns:cx3="http://schemas.microsoft.com/office/drawing/2016/5/9/chartex" xmlns:cx4="http://schemas.microsoft.com/office/drawing/2016/5/10/chartex" xmlns:cx5="http://schemas.microsoft.com/office/drawing/2016/5/11/chartex" xmlns:cx6="http://schemas.microsoft.com/office/drawing/2016/5/12/chartex" xmlns:cx7="http://schemas.microsoft.com/office/drawing/2016/5/13/chartex" xmlns:cx8="http://schemas.microsoft.com/office/drawing/2016/5/14/chartex" xmlns:mc="http://schemas.openxmlformats.org/markup-compatibility/2006" xmlns:aink="http://schemas.microsoft.com/office/drawing/2016/ink" xmlns:am3d="http://schemas.microsoft.com/office/drawing/2017/model3d" xmlns:o="urn:schemas-microsoft-com:office:office" xmlns:oel="http://schemas.microsoft.com/office/2019/extlst" xmlns:r="http://schemas.openxmlformats.org/officeDocument/2006/relationships" xmlns:m="http://schemas.openxmlformats.org/officeDocument/2006/math" xmlns:v="urn:schemas-microsoft-com:vml" xmlns:wp14="http://schemas.microsoft.com/office/word/2010/wordprocessingDrawing" xmlns:wp="http://schemas.openxmlformats.org/drawingml/2006/wordprocessingDrawing" xmlns:w10="urn:schemas-microsoft-com:office:word" xmlns:w="http://schemas.openxmlformats.org/wordprocessingml/2006/main" xmlns:w14="http://schemas.microsoft.com/office/word/2010/wordml" xmlns:w15="http://schemas.microsoft.com/office/word/2012/wordml" xmlns:w16cex="http://schemas.microsoft.com/office/word/2018/wordml/cex" xmlns:w16cid="http://schemas.microsoft.com/office/word/2016/wordml/cid" xmlns:w16="http://schemas.microsoft.com/office/word/2018/wordml" xmlns:w16du="http://schemas.microsoft.com/office/word/2023/wordml/word16du" xmlns:w16sdtdh="http://schemas.microsoft.com/office/word/2020/wordml/sdtdatahash" xmlns:w16sdtfl="http://schemas.microsoft.com/office/word/2024/wordml/sdtformatlock" xmlns:w16se="http://schemas.microsoft.com/office/word/2015/wordml/symex" xmlns:wpg="http://schemas.microsoft.com/office/word/2010/wordprocessingGroup" xmlns:wpi="http://schemas.microsoft.com/office/word/2010/wordprocessingInk" xmlns:wne="http://schemas.microsoft.com/office/word/2006/wordml" xmlns:wps="http://schemas.microsoft.com/office/word/2010/wordprocessingShape" mc:Ignorable="w14 w15 w16se w16cid w16 w16cex w16sdtdh w16sdtfl w16du wp14">
+<w:numbering xmlns:wpc="http://schemas.microsoft.com/office/word/2010/wordprocessingCanvas" xmlns:cx="http://schemas.microsoft.com/office/drawing/2014/chartex" xmlns:cx1="http://schemas.microsoft.com/office/drawing/2015/9/8/chartex" xmlns:cx2="http://schemas.microsoft.com/office/drawing/2015/10/21/chartex" xmlns:cx3="http://schemas.microsoft.com/office/drawing/2016/5/9/chartex" xmlns:cx4="http://schemas.microsoft.com/office/drawing/2016/5/10/chartex" xmlns:cx5="http://schemas.microsoft.com/office/drawing/2016/5/11/chartex" xmlns:cx6="http://schemas.microsoft.com/office/drawing/2016/5/12/chartex" xmlns:cx7="http://schemas.microsoft.com/office/drawing/2016/5/13/chartex" xmlns:cx8="http://schemas.microsoft.com/office/drawing/2016/5/14/chartex" xmlns:mc="http://schemas.openxmlformats.org/markup-compatibility/2006" xmlns:aink="http://schemas.microsoft.com/office/drawing/2016/ink" xmlns:am3d="http://schemas.microsoft.com/office/drawing/2017/model3d" xmlns:o="urn:schemas-microsoft-com:office:office" xmlns:oel="http://schemas.microsoft.com/office/2019/extlst" xmlns:r="http://schemas.openxmlformats.org/officeDocument/2006/relationships" xmlns:m="http://schemas.openxmlformats.org/officeDocument/2006/math" xmlns:v="urn:schemas-microsoft-com:vml" xmlns:wp14="http://schemas.microsoft.com/office/word/2010/wordprocessingDrawing" xmlns:wp="http://schemas.openxmlformats.org/drawingml/2006/wordprocessingDrawing" xmlns:w10="urn:schemas-microsoft-com:office:word" xmlns:w="http://schemas.openxmlformats.org/wordprocessingml/2006/main" xmlns:w14="http://schemas.microsoft.com/office/word/2010/wordml" xmlns:w15="http://schemas.microsoft.com/office/word/2012/wordml" xmlns:w16cei="http://schemas.microsoft.com/office/word/2026/wordml/cei" xmlns:w16cex="http://schemas.microsoft.com/office/word/2018/wordml/cex" xmlns:w16cid="http://schemas.microsoft.com/office/word/2016/wordml/cid" xmlns:w16="http://schemas.microsoft.com/office/word/2018/wordml" xmlns:w16du="http://schemas.microsoft.com/office/word/2023/wordml/word16du" xmlns:w16sdtdh="http://schemas.microsoft.com/office/word/2020/wordml/sdtdatahash" xmlns:w16sdtfl="http://schemas.microsoft.com/office/word/2024/wordml/sdtformatlock" xmlns:w16se="http://schemas.microsoft.com/office/word/2015/wordml/symex" xmlns:wpg="http://schemas.microsoft.com/office/word/2010/wordprocessingGroup" xmlns:wpi="http://schemas.microsoft.com/office/word/2010/wordprocessingInk" xmlns:wne="http://schemas.microsoft.com/office/word/2006/wordml" xmlns:wps="http://schemas.microsoft.com/office/word/2010/wordprocessingShape" mc:Ignorable="w14 w15 w16se w16cid w16 w16cex w16sdtdh w16sdtfl w16du wp14">
   <w:abstractNum w:abstractNumId="0" w15:restartNumberingAfterBreak="0">
     <w:nsid w:val="05DD18D1"/>
     <w:multiLevelType w:val="multilevel"/>
@@ -4535,6 +4902,29 @@
       <w:szCs w:val="48"/>
     </w:rPr>
   </w:style>
+  <w:style w:type="character" w:styleId="Hyperlink">
+    <w:name w:val="Hyperlink"/>
+    <w:basedOn w:val="DefaultParagraphFont"/>
+    <w:uiPriority w:val="99"/>
+    <w:semiHidden/>
+    <w:unhideWhenUsed/>
+    <w:rsid w:val="00F078E9"/>
+    <w:rPr>
+      <w:color w:val="0563C1"/>
+      <w:u w:val="single"/>
+    </w:rPr>
+  </w:style>
+  <w:style w:type="paragraph" w:styleId="ListParagraph">
+    <w:name w:val="List Paragraph"/>
+    <w:basedOn w:val="Normal"/>
+    <w:uiPriority w:val="34"/>
+    <w:qFormat/>
+    <w:rsid w:val="00944794"/>
+    <w:pPr>
+      <w:ind w:left="720"/>
+      <w:contextualSpacing/>
+    </w:pPr>
+  </w:style>
 </w:styles>
 </file>
 

</xml_diff>